<commit_message>
Mantenibilidad y consistencia funcional
</commit_message>
<xml_diff>
--- a/Prioridad 2 — Mantenibilidad y consistencia funcional.docx
+++ b/Prioridad 2 — Mantenibilidad y consistencia funcional.docx
@@ -3161,6 +3161,2744 @@
       <w:r>
         <w:rPr/>
         <w:t xml:space="preserve"> no las marqué como aprobadas. El recorrido de UI requiere una instancia y usuarios de prueba; Finkok y SMTP requieren acceso, certificados o credenciales externos. Documenté esos bloqueos y los pasos esperados para probarlos de forma segura, sin incluir secretos en el repositorio.</w:t>
+      </w:r>
+    </w:p>
+    <w:p>
+      <w:pPr>
+        <w:pStyle w:val="BodyText"/>
+        <w:bidi w:val="0"/>
+        <w:jc w:val="left"/>
+        <w:rPr/>
+      </w:pPr>
+      <w:r>
+        <w:rPr/>
+      </w:r>
+      <w:r>
+        <w:br w:type="page"/>
+      </w:r>
+    </w:p>
+    <w:p>
+      <w:pPr>
+        <w:pStyle w:val="BodyText"/>
+        <w:bidi w:val="0"/>
+        <w:jc w:val="left"/>
+        <w:rPr/>
+      </w:pPr>
+      <w:r>
+        <w:rPr/>
+        <w:t>lee el archivo: "Por realizar 15 de octubre.md" y atiende las tareas "Prioridad 0 — Validaciones antes de operar en producción" hasta terminar, luego actualiza el documento indicando el avance o si algo no quedó completo o terminado</w:t>
+      </w:r>
+    </w:p>
+    <w:p>
+      <w:pPr>
+        <w:pStyle w:val="BodyText"/>
+        <w:bidi w:val="0"/>
+        <w:jc w:val="left"/>
+        <w:rPr/>
+      </w:pPr>
+      <w:r>
+        <w:rPr/>
+      </w:r>
+    </w:p>
+    <w:p>
+      <w:pPr>
+        <w:pStyle w:val="BodyText"/>
+        <w:bidi w:val="0"/>
+        <w:jc w:val="left"/>
+        <w:rPr/>
+      </w:pPr>
+      <w:r>
+        <w:rPr/>
+      </w:r>
+    </w:p>
+    <w:p>
+      <w:pPr>
+        <w:pStyle w:val="BodyText"/>
+        <w:bidi w:val="0"/>
+        <w:jc w:val="left"/>
+        <w:rPr/>
+      </w:pPr>
+      <w:r>
+        <w:rPr/>
+        <w:t>Prioridad 0 atendida. Resumen:</w:t>
+      </w:r>
+    </w:p>
+    <w:p>
+      <w:pPr>
+        <w:pStyle w:val="BodyText"/>
+        <w:bidi w:val="0"/>
+        <w:jc w:val="left"/>
+        <w:rPr/>
+      </w:pPr>
+      <w:r>
+        <w:rPr>
+          <w:b/>
+        </w:rPr>
+        <w:t>P0 #1 — Finkok TEST: ⏳ BLOQUEADO.</w:t>
+      </w:r>
+      <w:r>
+        <w:rPr/>
+        <w:t xml:space="preserve"> Sin CSD (</w:t>
+      </w:r>
+      <w:r>
+        <w:rPr>
+          <w:rFonts w:ascii="Liberation Mono" w:hAnsi="Liberation Mono"/>
+        </w:rPr>
+        <w:t>certs/</w:t>
+      </w:r>
+      <w:r>
+        <w:rPr/>
+        <w:t xml:space="preserve"> no existe) ni credenciales Finkok no se puede timbrar real. Verifiqué por código: </w:t>
+      </w:r>
+      <w:r>
+        <w:rPr>
+          <w:rFonts w:ascii="Liberation Mono" w:hAnsi="Liberation Mono"/>
+        </w:rPr>
+        <w:t>PacTimbradoService</w:t>
+      </w:r>
+      <w:r>
+        <w:rPr/>
+        <w:t xml:space="preserve"> soporta SIMULADO/TEST/PRODUCCION, </w:t>
+      </w:r>
+      <w:r>
+        <w:rPr>
+          <w:rFonts w:ascii="Liberation Mono" w:hAnsi="Liberation Mono"/>
+        </w:rPr>
+        <w:t>DatosPac</w:t>
+      </w:r>
+      <w:r>
+        <w:rPr/>
+        <w:t xml:space="preserve"> falla cerrado sin credenciales, reintento ante incidencia 307, </w:t>
+      </w:r>
+      <w:r>
+        <w:rPr>
+          <w:rFonts w:ascii="Liberation Mono" w:hAnsi="Liberation Mono"/>
+        </w:rPr>
+        <w:t>cancel_signature</w:t>
+      </w:r>
+      <w:r>
+        <w:rPr/>
+        <w:t xml:space="preserve"> firmada localmente, </w:t>
+      </w:r>
+      <w:r>
+        <w:rPr>
+          <w:rFonts w:ascii="Liberation Mono" w:hAnsi="Liberation Mono"/>
+        </w:rPr>
+        <w:t>EstadoSatAsync</w:t>
+      </w:r>
+      <w:r>
+        <w:rPr/>
+        <w:t xml:space="preserve"> vía </w:t>
+      </w:r>
+      <w:r>
+        <w:rPr>
+          <w:rFonts w:ascii="Liberation Mono" w:hAnsi="Liberation Mono"/>
+        </w:rPr>
+        <w:t>get_sat_status</w:t>
+      </w:r>
+      <w:r>
+        <w:rPr/>
+        <w:t xml:space="preserve">, y </w:t>
+      </w:r>
+      <w:r>
+        <w:rPr>
+          <w:rFonts w:ascii="Liberation Mono" w:hAnsi="Liberation Mono"/>
+        </w:rPr>
+        <w:t>/facturacion</w:t>
+      </w:r>
+      <w:r>
+        <w:rPr/>
+        <w:t xml:space="preserve"> muestra el modo PAC. Dejé guía: </w:t>
+      </w:r>
+      <w:r>
+        <w:rPr>
+          <w:rFonts w:ascii="Liberation Mono" w:hAnsi="Liberation Mono"/>
+        </w:rPr>
+        <w:t>docs-validacion-finkok-test.md</w:t>
+      </w:r>
+      <w:r>
+        <w:rPr/>
+        <w:t>.</w:t>
+      </w:r>
+    </w:p>
+    <w:p>
+      <w:pPr>
+        <w:pStyle w:val="BodyText"/>
+        <w:bidi w:val="0"/>
+        <w:jc w:val="left"/>
+        <w:rPr/>
+      </w:pPr>
+      <w:r>
+        <w:rPr>
+          <w:b/>
+        </w:rPr>
+        <w:t>P0 #2 — SMTP: ⏳ BLOQUEADO.</w:t>
+      </w:r>
+      <w:r>
+        <w:rPr/>
+        <w:t xml:space="preserve"> Sin servidor SMTP no hay envío real. Verifiqué por código: </w:t>
+      </w:r>
+      <w:r>
+        <w:rPr>
+          <w:rFonts w:ascii="Liberation Mono" w:hAnsi="Liberation Mono"/>
+        </w:rPr>
+        <w:t>EmailService</w:t>
+      </w:r>
+      <w:r>
+        <w:rPr/>
+        <w:t xml:space="preserve"> (MailKit) con </w:t>
+      </w:r>
+      <w:r>
+        <w:rPr>
+          <w:rFonts w:ascii="Liberation Mono" w:hAnsi="Liberation Mono"/>
+        </w:rPr>
+        <w:t>ProbarAsync</w:t>
+      </w:r>
+      <w:r>
+        <w:rPr/>
+        <w:t xml:space="preserve">, </w:t>
+      </w:r>
+      <w:r>
+        <w:rPr>
+          <w:rFonts w:ascii="Liberation Mono" w:hAnsi="Liberation Mono"/>
+        </w:rPr>
+        <w:t>EnviarCfdiAsync</w:t>
+      </w:r>
+      <w:r>
+        <w:rPr/>
+        <w:t xml:space="preserve"> adjunta XML + PDF (defensivo), estados CxC/CxP, comunicados y validación fail-closed. Guía: </w:t>
+      </w:r>
+      <w:r>
+        <w:rPr>
+          <w:rFonts w:ascii="Liberation Mono" w:hAnsi="Liberation Mono"/>
+        </w:rPr>
+        <w:t>docs-validacion-smtp.md</w:t>
+      </w:r>
+      <w:r>
+        <w:rPr/>
+        <w:t>.</w:t>
+      </w:r>
+    </w:p>
+    <w:p>
+      <w:pPr>
+        <w:pStyle w:val="BodyText"/>
+        <w:bidi w:val="0"/>
+        <w:jc w:val="left"/>
+        <w:rPr/>
+      </w:pPr>
+      <w:r>
+        <w:rPr>
+          <w:b/>
+        </w:rPr>
+        <w:t>P0 #3 — Cierre PostgreSQL: ✅ automatizado / ⏳ smoke UI.</w:t>
+      </w:r>
+      <w:r>
+        <w:rPr/>
+        <w:t xml:space="preserve"> Nueva prueba </w:t>
+      </w:r>
+      <w:r>
+        <w:rPr>
+          <w:rFonts w:ascii="Liberation Mono" w:hAnsi="Liberation Mono"/>
+        </w:rPr>
+        <w:t>PostgreSQL_conciliacion_...</w:t>
+      </w:r>
+      <w:r>
+        <w:rPr/>
+        <w:t xml:space="preserve"> en Testcontainers: compra → venta → cierre FIFO $500 → bloqueo → reapertura Admin. 8/8 PostgreSQL OK. Falta el recorrido manual en </w:t>
+      </w:r>
+      <w:r>
+        <w:rPr>
+          <w:rFonts w:ascii="Liberation Mono" w:hAnsi="Liberation Mono"/>
+        </w:rPr>
+        <w:t>/reportes</w:t>
+      </w:r>
+      <w:r>
+        <w:rPr/>
+        <w:t>.</w:t>
+      </w:r>
+    </w:p>
+    <w:p>
+      <w:pPr>
+        <w:pStyle w:val="BodyText"/>
+        <w:bidi w:val="0"/>
+        <w:jc w:val="left"/>
+        <w:rPr/>
+      </w:pPr>
+      <w:r>
+        <w:rPr>
+          <w:b/>
+        </w:rPr>
+        <w:t>P0 #4 — Conciliación: ✅ automatizado / ⏳ smoke UI.</w:t>
+      </w:r>
+      <w:r>
+        <w:rPr/>
+        <w:t xml:space="preserve"> La misma prueba concilia Balance (cuadra), ER (1000/160/500/500) y existencias (0+100−50=50 vs kardex/stock).</w:t>
+      </w:r>
+    </w:p>
+    <w:p>
+      <w:pPr>
+        <w:pStyle w:val="BodyText"/>
+        <w:bidi w:val="0"/>
+        <w:jc w:val="left"/>
+        <w:rPr/>
+      </w:pPr>
+      <w:r>
+        <w:rPr>
+          <w:b/>
+        </w:rPr>
+        <w:t>Hallazgo:</w:t>
+      </w:r>
+      <w:r>
+        <w:rPr/>
+        <w:t xml:space="preserve"> tu prueba nueva expuso un bug real — </w:t>
+      </w:r>
+      <w:r>
+        <w:rPr>
+          <w:rFonts w:ascii="Liberation Mono" w:hAnsi="Liberation Mono"/>
+        </w:rPr>
+        <w:t>BalanceAsync</w:t>
+      </w:r>
+      <w:r>
+        <w:rPr/>
+        <w:t xml:space="preserve"> calculaba el resultado con signo invertido y no normalizaba cuentas a su naturaleza. Corregido en </w:t>
+      </w:r>
+      <w:r>
+        <w:rPr>
+          <w:rFonts w:ascii="Liberation Mono" w:hAnsi="Liberation Mono"/>
+        </w:rPr>
+        <w:t>ReportesFinancierosService.cs</w:t>
+      </w:r>
+      <w:r>
+        <w:rPr/>
+        <w:t>.</w:t>
+      </w:r>
+    </w:p>
+    <w:p>
+      <w:pPr>
+        <w:pStyle w:val="BodyText"/>
+        <w:bidi w:val="0"/>
+        <w:jc w:val="left"/>
+        <w:rPr/>
+      </w:pPr>
+      <w:r>
+        <w:rPr>
+          <w:b/>
+        </w:rPr>
+        <w:t>Validación:</w:t>
+      </w:r>
+      <w:r>
+        <w:rPr/>
+        <w:t xml:space="preserve"> build 0 errores, 36/36 pruebas (28 InMemory + 8 PostgreSQL). Documento </w:t>
+      </w:r>
+      <w:r>
+        <w:rPr>
+          <w:rFonts w:ascii="Liberation Mono" w:hAnsi="Liberation Mono"/>
+        </w:rPr>
+        <w:t>Por realizar 15 de octubre.md</w:t>
+      </w:r>
+      <w:r>
+        <w:rPr/>
+        <w:t xml:space="preserve"> actualizado con el avance por tarea.</w:t>
+      </w:r>
+    </w:p>
+    <w:p>
+      <w:pPr>
+        <w:pStyle w:val="BodyText"/>
+        <w:bidi w:val="0"/>
+        <w:jc w:val="left"/>
+        <w:rPr/>
+      </w:pPr>
+      <w:r>
+        <w:rPr/>
+      </w:r>
+      <w:r>
+        <w:br w:type="page"/>
+      </w:r>
+    </w:p>
+    <w:p>
+      <w:pPr>
+        <w:pStyle w:val="BodyText"/>
+        <w:bidi w:val="0"/>
+        <w:jc w:val="left"/>
+        <w:rPr/>
+      </w:pPr>
+      <w:r>
+        <w:rPr/>
+        <w:t>Voy a comparar los requisitos de esa prioridad con lo implementado y revisar los cambios relacionados para detectar omisiones o riesgos de integridad.</w:t>
+      </w:r>
+    </w:p>
+    <w:p>
+      <w:pPr>
+        <w:pStyle w:val="BodyText"/>
+        <w:bidi w:val="0"/>
+        <w:jc w:val="left"/>
+        <w:rPr/>
+      </w:pPr>
+      <w:r>
+        <w:rPr/>
+        <w:t>Read Completed with input: { "path": "D:\GMS\Jerry\OilsMexico\Por realizar 15 de octubre.md" }</w:t>
+      </w:r>
+    </w:p>
+    <w:p>
+      <w:pPr>
+        <w:pStyle w:val="BodyText"/>
+        <w:bidi w:val="0"/>
+        <w:jc w:val="left"/>
+        <w:rPr/>
+      </w:pPr>
+      <w:r>
+        <w:rPr/>
+        <w:t>Read Completed with input: { "path": "D:\GMS\Jerry\OilsMexico\src\OilsMexico.Infrastructure\Services\CatalogosService.cs" }</w:t>
+      </w:r>
+    </w:p>
+    <w:p>
+      <w:pPr>
+        <w:pStyle w:val="BodyText"/>
+        <w:bidi w:val="0"/>
+        <w:jc w:val="left"/>
+        <w:rPr/>
+      </w:pPr>
+      <w:r>
+        <w:rPr/>
+        <w:t>Ran terminal command: git status --short; git --no-pager diff --stat</w:t>
+      </w:r>
+    </w:p>
+    <w:p>
+      <w:pPr>
+        <w:pStyle w:val="BodyText"/>
+        <w:bidi w:val="0"/>
+        <w:jc w:val="left"/>
+        <w:rPr/>
+      </w:pPr>
+      <w:r>
+        <w:rPr/>
+        <w:t xml:space="preserve">Search for </w:t>
+      </w:r>
+      <w:r>
+        <w:rPr>
+          <w:rFonts w:ascii="Liberation Mono" w:hAnsi="Liberation Mono"/>
+        </w:rPr>
+        <w:t>Prioridad 1|integridad contable|datos</w:t>
+      </w:r>
+    </w:p>
+    <w:p>
+      <w:pPr>
+        <w:pStyle w:val="BodyText"/>
+        <w:bidi w:val="0"/>
+        <w:jc w:val="left"/>
+        <w:rPr/>
+      </w:pPr>
+      <w:r>
+        <w:rPr/>
+        <w:t>Read , lines 1 to 230 Completed with input: { "path": "D:\GMS\Jerry\OilsMexico\src\OilsMexico.Infrastructure\Services\CatalogosService.cs", "view_range": [ 1, 230 ] }</w:t>
+      </w:r>
+    </w:p>
+    <w:p>
+      <w:pPr>
+        <w:pStyle w:val="BodyText"/>
+        <w:bidi w:val="0"/>
+        <w:jc w:val="left"/>
+        <w:rPr/>
+      </w:pPr>
+      <w:r>
+        <w:rPr/>
+        <w:t>Read , lines 231 to 460 Completed with input: { "path": "D:\GMS\Jerry\OilsMexico\src\OilsMexico.Infrastructure\Services\CatalogosService.cs", "view_range": [ 231, 460 ] }</w:t>
+      </w:r>
+    </w:p>
+    <w:p>
+      <w:pPr>
+        <w:pStyle w:val="BodyText"/>
+        <w:bidi w:val="0"/>
+        <w:jc w:val="left"/>
+        <w:rPr/>
+      </w:pPr>
+      <w:r>
+        <w:rPr/>
+        <w:t>Ran terminal command: git --no-pager diff -- src/OilsMexico.Infrastructure/Services</w:t>
+      </w:r>
+    </w:p>
+    <w:p>
+      <w:pPr>
+        <w:pStyle w:val="BodyText"/>
+        <w:bidi w:val="0"/>
+        <w:jc w:val="left"/>
+        <w:rPr/>
+      </w:pPr>
+      <w:r>
+        <w:rPr/>
+        <w:t>Read , lines 84 to 98 Completed with input: { "path": "D:\GMS\Jerry\OilsMexico\Por realizar 15 de octubre.md", "view_range": [ 84, 98 ] }</w:t>
+      </w:r>
+    </w:p>
+    <w:p>
+      <w:pPr>
+        <w:pStyle w:val="BodyText"/>
+        <w:bidi w:val="0"/>
+        <w:jc w:val="left"/>
+        <w:rPr/>
+      </w:pPr>
+      <w:r>
+        <w:rPr/>
+        <w:t>Read tool output Completed with input: { "path": "C:\Users\usuario\AppData\Local\Temp\1792088267599-copilot-tool-output-25432-6984ec4c-bc69-49a5-abe2-df0bc44518ee.txt", "view_range": [ 1, 220 ] }</w:t>
+      </w:r>
+    </w:p>
+    <w:p>
+      <w:pPr>
+        <w:pStyle w:val="BodyText"/>
+        <w:bidi w:val="0"/>
+        <w:jc w:val="left"/>
+        <w:rPr/>
+      </w:pPr>
+      <w:r>
+        <w:rPr/>
+        <w:t>Read , lines 200 to 437 Completed with input: { "path": "D:\GMS\Jerry\OilsMexico\src\OilsMexico.Infrastructure\Services\CatalogosService.cs", "view_range": [ 200, 437 ] }</w:t>
+      </w:r>
+    </w:p>
+    <w:p>
+      <w:pPr>
+        <w:pStyle w:val="BodyText"/>
+        <w:bidi w:val="0"/>
+        <w:jc w:val="left"/>
+        <w:rPr/>
+      </w:pPr>
+      <w:r>
+        <w:rPr/>
+        <w:t xml:space="preserve">Find files matching </w:t>
+      </w:r>
+      <w:r>
+        <w:rPr>
+          <w:rFonts w:ascii="Liberation Mono" w:hAnsi="Liberation Mono"/>
+        </w:rPr>
+        <w:t>**/*Periodo*Test*.cs</w:t>
+      </w:r>
+    </w:p>
+    <w:p>
+      <w:pPr>
+        <w:pStyle w:val="BodyText"/>
+        <w:bidi w:val="0"/>
+        <w:jc w:val="left"/>
+        <w:rPr/>
+      </w:pPr>
+      <w:r>
+        <w:rPr/>
+        <w:t>La revisión muestra cambios distribuidos en los servicios contables, además del catálogo señalado. Ahora estoy comprobando que los bloqueos de periodo cubran las mutaciones reales y que las auditorías se guarden de forma consistente con cada operación.</w:t>
+      </w:r>
+    </w:p>
+    <w:p>
+      <w:pPr>
+        <w:pStyle w:val="BodyText"/>
+        <w:bidi w:val="0"/>
+        <w:jc w:val="left"/>
+        <w:rPr/>
+      </w:pPr>
+      <w:r>
+        <w:rPr/>
+        <w:t>Read tool output Completed with input: { "path": "C:\Users\usuario\AppData\Local\Temp\1792088267599-copilot-tool-output-25432-6984ec4c-bc69-49a5-abe2-df0bc44518ee.txt", "view_range": [ 180, 436 ] }</w:t>
+      </w:r>
+    </w:p>
+    <w:p>
+      <w:pPr>
+        <w:pStyle w:val="BodyText"/>
+        <w:bidi w:val="0"/>
+        <w:jc w:val="left"/>
+        <w:rPr/>
+      </w:pPr>
+      <w:r>
+        <w:rPr/>
+        <w:t xml:space="preserve">Search for </w:t>
+      </w:r>
+      <w:r>
+        <w:rPr>
+          <w:rFonts w:ascii="Liberation Mono" w:hAnsi="Liberation Mono"/>
+        </w:rPr>
+        <w:t>ObtenerCotizacionAsync|ObtenerOrdenVentaAsync|ReglaPeriodoCerrado|RegistrarAu...</w:t>
+      </w:r>
+    </w:p>
+    <w:p>
+      <w:pPr>
+        <w:pStyle w:val="BodyText"/>
+        <w:bidi w:val="0"/>
+        <w:jc w:val="left"/>
+        <w:rPr/>
+      </w:pPr>
+      <w:r>
+        <w:rPr/>
+        <w:t xml:space="preserve">Find files matching </w:t>
+      </w:r>
+      <w:r>
+        <w:rPr>
+          <w:rFonts w:ascii="Liberation Mono" w:hAnsi="Liberation Mono"/>
+        </w:rPr>
+        <w:t>tests/**/*.cs</w:t>
+      </w:r>
+    </w:p>
+    <w:p>
+      <w:pPr>
+        <w:pStyle w:val="BodyText"/>
+        <w:bidi w:val="0"/>
+        <w:jc w:val="left"/>
+        <w:rPr/>
+      </w:pPr>
+      <w:r>
+        <w:rPr/>
+        <w:t>Read Completed with input: { "path": "D:\GMS\Jerry\OilsMexico\src\OilsMexico.Domain\Services\ReglaPeriodoCerrado.cs" }</w:t>
+      </w:r>
+    </w:p>
+    <w:p>
+      <w:pPr>
+        <w:pStyle w:val="BodyText"/>
+        <w:bidi w:val="0"/>
+        <w:jc w:val="left"/>
+        <w:rPr/>
+      </w:pPr>
+      <w:r>
+        <w:rPr/>
+        <w:t xml:space="preserve">Search for </w:t>
+      </w:r>
+      <w:r>
+        <w:rPr>
+          <w:rFonts w:ascii="Liberation Mono" w:hAnsi="Liberation Mono"/>
+        </w:rPr>
+        <w:t>RegistrarAuditoria\(</w:t>
+      </w:r>
+    </w:p>
+    <w:p>
+      <w:pPr>
+        <w:pStyle w:val="BodyText"/>
+        <w:bidi w:val="0"/>
+        <w:jc w:val="left"/>
+        <w:rPr/>
+      </w:pPr>
+      <w:r>
+        <w:rPr/>
+        <w:t>Read tool output Completed with input: { "path": "C:\Users\usuario\AppData\Local\Temp\1792088267599-copilot-tool-output-25432-6984ec4c-bc69-49a5-abe2-df0bc44518ee.txt", "view_range": [ 300, 436 ] }</w:t>
+      </w:r>
+    </w:p>
+    <w:p>
+      <w:pPr>
+        <w:pStyle w:val="BodyText"/>
+        <w:bidi w:val="0"/>
+        <w:jc w:val="left"/>
+        <w:rPr/>
+      </w:pPr>
+      <w:r>
+        <w:rPr/>
+        <w:t>Read Completed with input: { "path": "D:\GMS\Jerry\OilsMexico\tests\OilsMexico.IntegrationTests\PostgresP1Tests.cs" }</w:t>
+      </w:r>
+    </w:p>
+    <w:p>
+      <w:pPr>
+        <w:pStyle w:val="BodyText"/>
+        <w:bidi w:val="0"/>
+        <w:jc w:val="left"/>
+        <w:rPr/>
+      </w:pPr>
+      <w:r>
+        <w:rPr/>
+        <w:t>Read Completed with input: { "path": "D:\GMS\Jerry\OilsMexico\tests\OilsMexico.IntegrationTests\AuditoriaTests.cs" }</w:t>
+      </w:r>
+    </w:p>
+    <w:p>
+      <w:pPr>
+        <w:pStyle w:val="BodyText"/>
+        <w:bidi w:val="0"/>
+        <w:jc w:val="left"/>
+        <w:rPr/>
+      </w:pPr>
+      <w:r>
+        <w:rPr/>
+        <w:t>"Read" failed Completed with input: { "path": "D:\GMS\Jerry\OilsMexico\src\OilsMexico.Infrastructure\Services\CotizacionesService.Consulta.cs" } Tool execution failed: Path does not exist</w:t>
+      </w:r>
+    </w:p>
+    <w:p>
+      <w:pPr>
+        <w:pStyle w:val="BodyText"/>
+        <w:bidi w:val="0"/>
+        <w:jc w:val="left"/>
+        <w:rPr/>
+      </w:pPr>
+      <w:r>
+        <w:rPr/>
+        <w:t xml:space="preserve">Find files matching </w:t>
+      </w:r>
+      <w:r>
+        <w:rPr>
+          <w:rFonts w:ascii="Liberation Mono" w:hAnsi="Liberation Mono"/>
+        </w:rPr>
+        <w:t>src/OilsMexico.Infrastructure/Services/*Cotizacion*.cs</w:t>
+      </w:r>
+    </w:p>
+    <w:p>
+      <w:pPr>
+        <w:pStyle w:val="BodyText"/>
+        <w:bidi w:val="0"/>
+        <w:jc w:val="left"/>
+        <w:rPr/>
+      </w:pPr>
+      <w:r>
+        <w:rPr/>
+        <w:t xml:space="preserve">Search for </w:t>
+      </w:r>
+      <w:r>
+        <w:rPr>
+          <w:rFonts w:ascii="Liberation Mono" w:hAnsi="Liberation Mono"/>
+        </w:rPr>
+        <w:t>class .*Configur|Config|CierreCaja|CerrarCaja|CajaService|Cerrar.*Caja|Abrir....</w:t>
+      </w:r>
+    </w:p>
+    <w:p>
+      <w:pPr>
+        <w:pStyle w:val="BodyText"/>
+        <w:bidi w:val="0"/>
+        <w:jc w:val="left"/>
+        <w:rPr/>
+      </w:pPr>
+      <w:r>
+        <w:rPr/>
+        <w:t xml:space="preserve">Search for </w:t>
+      </w:r>
+      <w:r>
+        <w:rPr>
+          <w:rFonts w:ascii="Liberation Mono" w:hAnsi="Liberation Mono"/>
+        </w:rPr>
+        <w:t>FacturarOrden|Venta_en|Periodo|Periodo_cerrado|Auditoria|Auditoria_</w:t>
+      </w:r>
+    </w:p>
+    <w:p>
+      <w:pPr>
+        <w:pStyle w:val="BodyText"/>
+        <w:bidi w:val="0"/>
+        <w:jc w:val="left"/>
+        <w:rPr/>
+      </w:pPr>
+      <w:r>
+        <w:rPr/>
+        <w:t xml:space="preserve">Search for </w:t>
+      </w:r>
+      <w:r>
+        <w:rPr>
+          <w:rFonts w:ascii="Liberation Mono" w:hAnsi="Liberation Mono"/>
+        </w:rPr>
+        <w:t>new CatalogosService|CatalogosService\(</w:t>
+      </w:r>
+    </w:p>
+    <w:p>
+      <w:pPr>
+        <w:pStyle w:val="BodyText"/>
+        <w:bidi w:val="0"/>
+        <w:jc w:val="left"/>
+        <w:rPr/>
+      </w:pPr>
+      <w:r>
+        <w:rPr/>
+        <w:t>Read Completed with input: { "path": "D:\GMS\Jerry\OilsMexico\src\OilsMexico.Domain\Entities\AuditLog.cs" }</w:t>
+      </w:r>
+    </w:p>
+    <w:p>
+      <w:pPr>
+        <w:pStyle w:val="BodyText"/>
+        <w:bidi w:val="0"/>
+        <w:jc w:val="left"/>
+        <w:rPr/>
+      </w:pPr>
+      <w:r>
+        <w:rPr/>
+        <w:t>Read , lines 75 to 105 Completed with input: { "path": "D:\GMS\Jerry\OilsMexico\src\OilsMexico.Application\Interfaces\Servicios.cs", "view_range": [ 75, 105 ] }</w:t>
+      </w:r>
+    </w:p>
+    <w:p>
+      <w:pPr>
+        <w:pStyle w:val="BodyText"/>
+        <w:bidi w:val="0"/>
+        <w:jc w:val="left"/>
+        <w:rPr/>
+      </w:pPr>
+      <w:r>
+        <w:rPr/>
+        <w:t>Read Completed with input: { "path": "D:\GMS\Jerry\OilsMexico\src\OilsMexico.Infrastructure\Services\ConfiguracionService.cs" }</w:t>
+      </w:r>
+    </w:p>
+    <w:p>
+      <w:pPr>
+        <w:pStyle w:val="BodyText"/>
+        <w:bidi w:val="0"/>
+        <w:jc w:val="left"/>
+        <w:rPr/>
+      </w:pPr>
+      <w:r>
+        <w:rPr/>
+        <w:t>Read Completed with input: { "path": "D:\GMS\Jerry\OilsMexico\src\OilsMexico.Infrastructure\Services\CorteCajaService.Cierre.cs" }</w:t>
+      </w:r>
+    </w:p>
+    <w:p>
+      <w:pPr>
+        <w:pStyle w:val="BodyText"/>
+        <w:bidi w:val="0"/>
+        <w:jc w:val="left"/>
+        <w:rPr/>
+      </w:pPr>
+      <w:r>
+        <w:rPr/>
+        <w:t>Read Completed with input: { "path": "D:\GMS\Jerry\OilsMexico\src\OilsMexico.Infrastructure\Services\ComprasService.Cxp.cs" }</w:t>
+      </w:r>
+    </w:p>
+    <w:p>
+      <w:pPr>
+        <w:pStyle w:val="BodyText"/>
+        <w:bidi w:val="0"/>
+        <w:jc w:val="left"/>
+        <w:rPr/>
+      </w:pPr>
+      <w:r>
+        <w:rPr/>
+        <w:t>Read , lines 1 to 180 Completed with input: { "path": "D:\GMS\Jerry\OilsMexico\src\OilsMexico.Infrastructure\Services\ComprasService.cs", "view_range": [ 1, 180 ] }</w:t>
+      </w:r>
+    </w:p>
+    <w:p>
+      <w:pPr>
+        <w:pStyle w:val="BodyText"/>
+        <w:bidi w:val="0"/>
+        <w:jc w:val="left"/>
+        <w:rPr/>
+      </w:pPr>
+      <w:r>
+        <w:rPr/>
+        <w:t>Read Completed with input: { "path": "D:\GMS\Jerry\OilsMexico\src\OilsMexico.Infrastructure\Services\InventarioService.cs" }</w:t>
+      </w:r>
+    </w:p>
+    <w:p>
+      <w:pPr>
+        <w:pStyle w:val="BodyText"/>
+        <w:bidi w:val="0"/>
+        <w:jc w:val="left"/>
+        <w:rPr/>
+      </w:pPr>
+      <w:r>
+        <w:rPr/>
+        <w:t>Read , lines 100 to 330 Completed with input: { "path": "D:\GMS\Jerry\OilsMexico\tests\OilsMexico.IntegrationTests\PostgresP1Tests.cs", "view_range": [ 100, 330 ] }</w:t>
+      </w:r>
+    </w:p>
+    <w:p>
+      <w:pPr>
+        <w:pStyle w:val="BodyText"/>
+        <w:bidi w:val="0"/>
+        <w:jc w:val="left"/>
+        <w:rPr/>
+      </w:pPr>
+      <w:r>
+        <w:rPr/>
+        <w:t>Read Completed with input: { "path": "D:\GMS\Jerry\OilsMexico\src\OilsMexico.Infrastructure\Services\CotizacionesService.Consultas.cs" }</w:t>
+      </w:r>
+    </w:p>
+    <w:p>
+      <w:pPr>
+        <w:pStyle w:val="BodyText"/>
+        <w:bidi w:val="0"/>
+        <w:jc w:val="left"/>
+        <w:rPr/>
+      </w:pPr>
+      <w:r>
+        <w:rPr/>
+        <w:t>Read , lines 40 to 205 Completed with input: { "path": "D:\GMS\Jerry\OilsMexico\src\OilsMexico.Infrastructure\Services\CatalogosService.cs", "view_range": [ 40, 205 ] }</w:t>
+      </w:r>
+    </w:p>
+    <w:p>
+      <w:pPr>
+        <w:pStyle w:val="BodyText"/>
+        <w:bidi w:val="0"/>
+        <w:jc w:val="left"/>
+        <w:rPr/>
+      </w:pPr>
+      <w:r>
+        <w:rPr/>
+        <w:t>Read , lines 206 to 365 Completed with input: { "path": "D:\GMS\Jerry\OilsMexico\src\OilsMexico.Infrastructure\Services\CatalogosService.cs", "view_range": [ 206, 365 ] }</w:t>
+      </w:r>
+    </w:p>
+    <w:p>
+      <w:pPr>
+        <w:pStyle w:val="BodyText"/>
+        <w:bidi w:val="0"/>
+        <w:jc w:val="left"/>
+        <w:rPr/>
+      </w:pPr>
+      <w:r>
+        <w:rPr/>
+        <w:t>Read Completed with input: { "path": "D:\GMS\Jerry\OilsMexico\src\OilsMexico.Infrastructure\Services\CorteCajaService.cs" }</w:t>
+      </w:r>
+    </w:p>
+    <w:p>
+      <w:pPr>
+        <w:pStyle w:val="BodyText"/>
+        <w:bidi w:val="0"/>
+        <w:jc w:val="left"/>
+        <w:rPr/>
+      </w:pPr>
+      <w:r>
+        <w:rPr/>
+        <w:t xml:space="preserve">Search for </w:t>
+      </w:r>
+      <w:r>
+        <w:rPr>
+          <w:rFonts w:ascii="Liberation Mono" w:hAnsi="Liberation Mono"/>
+        </w:rPr>
+        <w:t>interface IConfiguracionService|interface ICorteCajaService|class Configuraci...</w:t>
+      </w:r>
+    </w:p>
+    <w:p>
+      <w:pPr>
+        <w:pStyle w:val="BodyText"/>
+        <w:bidi w:val="0"/>
+        <w:jc w:val="left"/>
+        <w:rPr/>
+      </w:pPr>
+      <w:r>
+        <w:rPr/>
+        <w:t xml:space="preserve">Search for </w:t>
+      </w:r>
+      <w:r>
+        <w:rPr>
+          <w:rFonts w:ascii="Liberation Mono" w:hAnsi="Liberation Mono"/>
+        </w:rPr>
+        <w:t>new InventarioService|new ConfiguracionService|new CorteCajaService|new Compr...</w:t>
+      </w:r>
+    </w:p>
+    <w:p>
+      <w:pPr>
+        <w:pStyle w:val="BodyText"/>
+        <w:bidi w:val="0"/>
+        <w:jc w:val="left"/>
+        <w:rPr/>
+      </w:pPr>
+      <w:r>
+        <w:rPr/>
+        <w:t xml:space="preserve">Search for </w:t>
+      </w:r>
+      <w:r>
+        <w:rPr>
+          <w:rFonts w:ascii="Liberation Mono" w:hAnsi="Liberation Mono"/>
+        </w:rPr>
+        <w:t>new ConfiguracionService\(|new CorteCajaService\(|new ComprasService\(|new Ca...</w:t>
+      </w:r>
+    </w:p>
+    <w:p>
+      <w:pPr>
+        <w:pStyle w:val="BodyText"/>
+        <w:bidi w:val="0"/>
+        <w:jc w:val="left"/>
+        <w:rPr/>
+      </w:pPr>
+      <w:r>
+        <w:rPr/>
+        <w:t>Read , lines 325 to 440 Completed with input: { "path": "D:\GMS\Jerry\OilsMexico\src\OilsMexico.Infrastructure\Services\CatalogosService.cs", "view_range": [ 325, 440 ] }</w:t>
+      </w:r>
+    </w:p>
+    <w:p>
+      <w:pPr>
+        <w:pStyle w:val="BodyText"/>
+        <w:bidi w:val="0"/>
+        <w:jc w:val="left"/>
+        <w:rPr/>
+      </w:pPr>
+      <w:r>
+        <w:rPr/>
+        <w:t>Read , lines 1 to 100 Completed with input: { "path": "D:\GMS\Jerry\OilsMexico\src\OilsMexico.Infrastructure\Services\CorteCajaService.Cierre.cs", "view_range": [ 1, 100 ] }</w:t>
+      </w:r>
+    </w:p>
+    <w:p>
+      <w:pPr>
+        <w:pStyle w:val="BodyText"/>
+        <w:bidi w:val="0"/>
+        <w:jc w:val="left"/>
+        <w:rPr/>
+      </w:pPr>
+      <w:r>
+        <w:rPr/>
+        <w:t>Read Completed with input: { "path": "D:\GMS\Jerry\OilsMexico\src\OilsMexico.Application\Interfaces\Configuracion.cs" }</w:t>
+      </w:r>
+    </w:p>
+    <w:p>
+      <w:pPr>
+        <w:pStyle w:val="BodyText"/>
+        <w:bidi w:val="0"/>
+        <w:jc w:val="left"/>
+        <w:rPr/>
+      </w:pPr>
+      <w:r>
+        <w:rPr/>
+        <w:t>Read , lines 32 to 60 Completed with input: { "path": "D:\GMS\Jerry\OilsMexico\src\OilsMexico.Application\Interfaces\FiscalCaja.cs", "view_range": [ 32, 60 ] }</w:t>
+      </w:r>
+    </w:p>
+    <w:p>
+      <w:pPr>
+        <w:pStyle w:val="BodyText"/>
+        <w:bidi w:val="0"/>
+        <w:jc w:val="left"/>
+        <w:rPr/>
+      </w:pPr>
+      <w:r>
+        <w:rPr/>
+        <w:t xml:space="preserve">Search for </w:t>
+      </w:r>
+      <w:r>
+        <w:rPr>
+          <w:rFonts w:ascii="Liberation Mono" w:hAnsi="Liberation Mono"/>
+        </w:rPr>
+        <w:t>GuardarAsync\(|GuardarMinutosTimeoutAsync|GuardarPoliticaBloqueoAsync</w:t>
+      </w:r>
+    </w:p>
+    <w:p>
+      <w:pPr>
+        <w:pStyle w:val="BodyText"/>
+        <w:bidi w:val="0"/>
+        <w:jc w:val="left"/>
+        <w:rPr/>
+      </w:pPr>
+      <w:r>
+        <w:rPr/>
+        <w:t xml:space="preserve">Search for </w:t>
+      </w:r>
+      <w:r>
+        <w:rPr>
+          <w:rFonts w:ascii="Liberation Mono" w:hAnsi="Liberation Mono"/>
+        </w:rPr>
+        <w:t>EntradaCompraAsync\(</w:t>
+      </w:r>
+    </w:p>
+    <w:p>
+      <w:pPr>
+        <w:pStyle w:val="BodyText"/>
+        <w:bidi w:val="0"/>
+        <w:jc w:val="left"/>
+        <w:rPr/>
+      </w:pPr>
+      <w:r>
+        <w:rPr/>
+        <w:t xml:space="preserve">Search for </w:t>
+      </w:r>
+      <w:r>
+        <w:rPr>
+          <w:rFonts w:ascii="Liberation Mono" w:hAnsi="Liberation Mono"/>
+        </w:rPr>
+        <w:t>class ProductoCatalogoDto|record ProductoCatalogoDto|class Compra|record Crea...</w:t>
+      </w:r>
+    </w:p>
+    <w:p>
+      <w:pPr>
+        <w:pStyle w:val="BodyText"/>
+        <w:bidi w:val="0"/>
+        <w:jc w:val="left"/>
+        <w:rPr/>
+      </w:pPr>
+      <w:r>
+        <w:rPr/>
+        <w:t xml:space="preserve">Search for </w:t>
+      </w:r>
+      <w:r>
+        <w:rPr>
+          <w:rFonts w:ascii="Liberation Mono" w:hAnsi="Liberation Mono"/>
+        </w:rPr>
+        <w:t>class Compra|class CorteCaja|class Configuracion</w:t>
+      </w:r>
+    </w:p>
+    <w:p>
+      <w:pPr>
+        <w:pStyle w:val="BodyText"/>
+        <w:bidi w:val="0"/>
+        <w:jc w:val="left"/>
+        <w:rPr/>
+      </w:pPr>
+      <w:r>
+        <w:rPr/>
+        <w:t>Read Completed with input: { "path": "D:\GMS\Jerry\OilsMexico\src\OilsMexico.Infrastructure\Services\GastoService.cs" }</w:t>
+      </w:r>
+    </w:p>
+    <w:p>
+      <w:pPr>
+        <w:pStyle w:val="BodyText"/>
+        <w:bidi w:val="0"/>
+        <w:jc w:val="left"/>
+        <w:rPr/>
+      </w:pPr>
+      <w:r>
+        <w:rPr/>
+        <w:t>Read Completed with input: { "path": "D:\GMS\Jerry\OilsMexico\src\OilsMexico.Infrastructure\Services\GastoService.Poliza.cs" }</w:t>
+      </w:r>
+    </w:p>
+    <w:p>
+      <w:pPr>
+        <w:pStyle w:val="BodyText"/>
+        <w:bidi w:val="0"/>
+        <w:jc w:val="left"/>
+        <w:rPr/>
+      </w:pPr>
+      <w:r>
+        <w:rPr/>
+        <w:t xml:space="preserve">Search for </w:t>
+      </w:r>
+      <w:r>
+        <w:rPr>
+          <w:rFonts w:ascii="Liberation Mono" w:hAnsi="Liberation Mono"/>
+        </w:rPr>
+        <w:t>ConfiguracionService|CorteCajaService|ComprasService</w:t>
+      </w:r>
+    </w:p>
+    <w:p>
+      <w:pPr>
+        <w:pStyle w:val="BodyText"/>
+        <w:bidi w:val="0"/>
+        <w:jc w:val="left"/>
+        <w:rPr/>
+      </w:pPr>
+      <w:r>
+        <w:rPr/>
+        <w:t xml:space="preserve">Encontré omisiones concretas: el helper de auditoría de catálogo nunca se invoca; compras, configuración y cierre de caja tampoco registran eventos. Además, </w:t>
+      </w:r>
+      <w:r>
+        <w:rPr>
+          <w:rFonts w:ascii="Liberation Mono" w:hAnsi="Liberation Mono"/>
+        </w:rPr>
+        <w:t>EntradaCompraAsync</w:t>
+      </w:r>
+      <w:r>
+        <w:rPr/>
+        <w:t xml:space="preserve"> puede cambiar existencias sin validar el periodo cerrado, aunque otras rutas de inventario sí lo hacen. Voy a cerrar esas brechas y añadir pruebas enfocadas.</w:t>
+      </w:r>
+    </w:p>
+    <w:p>
+      <w:pPr>
+        <w:pStyle w:val="BodyText"/>
+        <w:bidi w:val="0"/>
+        <w:jc w:val="left"/>
+        <w:rPr/>
+      </w:pPr>
+      <w:r>
+        <w:rPr/>
+        <w:t>Read , lines 1 to 115 Completed with input: { "path": "D:\GMS\Jerry\OilsMexico\src\OilsMexico.Application\DTOs\CatalogosDtos.cs", "view_range": [ 1, 115 ] }</w:t>
+      </w:r>
+    </w:p>
+    <w:p>
+      <w:pPr>
+        <w:pStyle w:val="BodyText"/>
+        <w:bidi w:val="0"/>
+        <w:jc w:val="left"/>
+        <w:rPr/>
+      </w:pPr>
+      <w:r>
+        <w:rPr/>
+        <w:t>Read Completed with input: { "path": "D:\GMS\Jerry\OilsMexico\src\OilsMexico.Domain\Entities\CorteCaja.cs" }</w:t>
+      </w:r>
+    </w:p>
+    <w:p>
+      <w:pPr>
+        <w:pStyle w:val="BodyText"/>
+        <w:bidi w:val="0"/>
+        <w:jc w:val="left"/>
+        <w:rPr/>
+      </w:pPr>
+      <w:r>
+        <w:rPr/>
+        <w:t>Read Completed with input: { "path": "D:\GMS\Jerry\OilsMexico\src\OilsMexico.Domain\Entities\Compra.cs" }</w:t>
+      </w:r>
+    </w:p>
+    <w:p>
+      <w:pPr>
+        <w:pStyle w:val="BodyText"/>
+        <w:bidi w:val="0"/>
+        <w:jc w:val="left"/>
+        <w:rPr/>
+      </w:pPr>
+      <w:r>
+        <w:rPr/>
+        <w:t>"Read" failed Completed with input: { "path": "D:\GMS\Jerry\OilsMexico\src\OilsMexico.Application\Services\SucursalContext.cs" } Tool execution failed: Path does not exist</w:t>
+      </w:r>
+    </w:p>
+    <w:p>
+      <w:pPr>
+        <w:pStyle w:val="BodyText"/>
+        <w:bidi w:val="0"/>
+        <w:jc w:val="left"/>
+        <w:rPr/>
+      </w:pPr>
+      <w:r>
+        <w:rPr/>
+        <w:t>Read Completed with input: { "path": "D:\GMS\Jerry\OilsMexico\src\OilsMexico.Application\DTOs\CompraDtos.cs" }</w:t>
+      </w:r>
+    </w:p>
+    <w:p>
+      <w:pPr>
+        <w:pStyle w:val="BodyText"/>
+        <w:bidi w:val="0"/>
+        <w:jc w:val="left"/>
+        <w:rPr/>
+      </w:pPr>
+      <w:r>
+        <w:rPr/>
+        <w:t xml:space="preserve">Search for </w:t>
+      </w:r>
+      <w:r>
+        <w:rPr>
+          <w:rFonts w:ascii="Liberation Mono" w:hAnsi="Liberation Mono"/>
+        </w:rPr>
+        <w:t>new CierreContableService|new ComprasService</w:t>
+      </w:r>
+    </w:p>
+    <w:p>
+      <w:pPr>
+        <w:pStyle w:val="BodyText"/>
+        <w:bidi w:val="0"/>
+        <w:jc w:val="left"/>
+        <w:rPr/>
+      </w:pPr>
+      <w:r>
+        <w:rPr/>
+        <w:t>Edit</w:t>
+      </w:r>
+    </w:p>
+    <w:p>
+      <w:pPr>
+        <w:pStyle w:val="BodyText"/>
+        <w:bidi w:val="0"/>
+        <w:jc w:val="left"/>
+        <w:rPr/>
+      </w:pPr>
+      <w:r>
+        <w:rPr/>
+        <w:t>Edit</w:t>
+      </w:r>
+    </w:p>
+    <w:p>
+      <w:pPr>
+        <w:pStyle w:val="BodyText"/>
+        <w:bidi w:val="0"/>
+        <w:jc w:val="left"/>
+        <w:rPr/>
+      </w:pPr>
+      <w:r>
+        <w:rPr/>
+        <w:t>"Apply Patch" failed Completed with input: "*** Begin Patch\n*** Update File: D:\GMS\Jerry\OilsMexico\src\OilsMexico.Infrastructure\Services\ComprasService.cs\n@@\n-/// Prioridad 1.1: recepción y pagos respetan periodo cerrado (mueven kardex/CxP).\n+/// Prioridad 1.1: recepción y pagos respetan periodo cerrado (mueven kardex/CxP).\n+/// Prioridad 1.2: órdenes, recepciones, pagos y cancelaciones quedan auditados.\n public sealed partial class ComprasService(ErpDbContext db, ISucursalContext ctx, ICierreContableService cierre) : IComprasService\n {\n+    private void RegistrarAuditoria(string tipo, string detalle, string? anterior, string? nuevo)\n+    {\n+        if (!ctx.Establecida || ctx.UsuarioId &lt;= 0)\n+            throw new InvalidOperationException("No se puede modificar una compra sin un usuario autenticado.");\n+        db.AuditLogs.Add(new AuditLog\n+        {\n+            UsuarioId = ctx.UsuarioId,\n+            Tipo = tipo,\n+            Detalle = detalle,\n+            Anterior = anterior,\n+            Nuevo = nuevo,\n+            FechaUtc = DateTime.UtcNow\n+        });\n+    }\n+\n@@\n         compra.Total = Math.Round(compra.Subtotal + compra.Iva, 2);\n         db.Compras.Add(compra);\n+        RegistrarAuditoria("CompraCreada",\n+            $"Compra {compra.FolioInterno} proveedor #{compra.ProveedorId}, sucursal {sucursalId}.",\n+            null, $"Estado={compra.Estado}; Total={compra.Total:N2}");\n         await db.SaveChangesAsync(ct);\n@@\n         if (compra.Estado == EstadoCompra.Cancelada) throw new InvalidOperationException("La compra está cancelada.");\n         if (req.Renglones.Count == 0) throw new InvalidOperationException("Nada que recibir.");\n@@\n         await using var tx = await db.Database.BeginTransactionAsync(ct);\n+        var estadoAnterior = compra.Estado.ToString();\n+        var litrosRecibidosAntes = compra.Detalles.Sum(d =&gt; d.LitrosRecibidos);\n         foreach (var r in req.Renglones)\n@@\n         compra.Estado = compra.Detalles.All(d =&gt; d.CantidadRecibida + 0.0001m &gt;= d.Cantidad)\n             ? EstadoCompra.Recibida : EstadoCompra.Parcial;\n+        RegistrarAuditoria("CompraRecibida", $"Recepción de compra #{compra.Id} ({compra.FolioInterno}).",\n+            $"Estado={estadoAnterior}; Litros={litrosRecibidosAntes:N2}",\n+            $"Estado={compra.Estado}; Litros={compra.Detalles.Sum(d =&gt; d.LitrosRecibidos):N2}");\n         await db.SaveChangesAsync(ct);\n*** End Patch" Tool execution failed: Failed to apply patch: Error: Failed to find expected lines in D:\GMS\Jerry\OilsMexico\src\OilsMexico.Infrastructure\Services\ComprasService.cs: if (compra.Estado == EstadoCompra.Cancelada) throw new InvalidOperationException("La compra está cancelada."); if (req.Renglones.Count == 0) throw new InvalidOperationException("Nada que recibir.");</w:t>
+      </w:r>
+    </w:p>
+    <w:p>
+      <w:pPr>
+        <w:pStyle w:val="BodyText"/>
+        <w:bidi w:val="0"/>
+        <w:jc w:val="left"/>
+        <w:rPr/>
+      </w:pPr>
+      <w:r>
+        <w:rPr/>
+        <w:t>Edit</w:t>
+      </w:r>
+    </w:p>
+    <w:p>
+      <w:pPr>
+        <w:pStyle w:val="BodyText"/>
+        <w:bidi w:val="0"/>
+        <w:jc w:val="left"/>
+        <w:rPr/>
+      </w:pPr>
+      <w:r>
+        <w:rPr/>
+        <w:t>Edit</w:t>
+      </w:r>
+    </w:p>
+    <w:p>
+      <w:pPr>
+        <w:pStyle w:val="BodyText"/>
+        <w:bidi w:val="0"/>
+        <w:jc w:val="left"/>
+        <w:rPr/>
+      </w:pPr>
+      <w:r>
+        <w:rPr/>
+        <w:t>Edit</w:t>
+      </w:r>
+    </w:p>
+    <w:p>
+      <w:pPr>
+        <w:pStyle w:val="BodyText"/>
+        <w:bidi w:val="0"/>
+        <w:jc w:val="left"/>
+        <w:rPr/>
+      </w:pPr>
+      <w:r>
+        <w:rPr/>
+        <w:t>Edit</w:t>
+      </w:r>
+    </w:p>
+    <w:p>
+      <w:pPr>
+        <w:pStyle w:val="BodyText"/>
+        <w:bidi w:val="0"/>
+        <w:jc w:val="left"/>
+        <w:rPr/>
+      </w:pPr>
+      <w:r>
+        <w:rPr/>
+        <w:t>Edit</w:t>
+      </w:r>
+    </w:p>
+    <w:p>
+      <w:pPr>
+        <w:pStyle w:val="BodyText"/>
+        <w:bidi w:val="0"/>
+        <w:jc w:val="left"/>
+        <w:rPr/>
+      </w:pPr>
+      <w:r>
+        <w:rPr/>
+        <w:t>Edit</w:t>
+      </w:r>
+    </w:p>
+    <w:p>
+      <w:pPr>
+        <w:pStyle w:val="BodyText"/>
+        <w:bidi w:val="0"/>
+        <w:jc w:val="left"/>
+        <w:rPr/>
+      </w:pPr>
+      <w:r>
+        <w:rPr/>
+        <w:t>Read , lines 1 to 110 Completed with input: { "path": "D:\GMS\Jerry\OilsMexico\tests\OilsMexico.IntegrationTests\PostgresP1Tests.cs", "view_range": [ 1, 110 ] }</w:t>
+      </w:r>
+    </w:p>
+    <w:p>
+      <w:pPr>
+        <w:pStyle w:val="BodyText"/>
+        <w:bidi w:val="0"/>
+        <w:jc w:val="left"/>
+        <w:rPr/>
+      </w:pPr>
+      <w:r>
+        <w:rPr/>
+        <w:t>Edit</w:t>
+      </w:r>
+    </w:p>
+    <w:p>
+      <w:pPr>
+        <w:pStyle w:val="BodyText"/>
+        <w:bidi w:val="0"/>
+        <w:jc w:val="left"/>
+        <w:rPr/>
+      </w:pPr>
+      <w:r>
+        <w:rPr/>
+        <w:t xml:space="preserve">Read skill </w:t>
+      </w:r>
+      <w:r>
+        <w:rPr>
+          <w:rFonts w:ascii="Liberation Mono" w:hAnsi="Liberation Mono"/>
+        </w:rPr>
+        <w:t>run-tests</w:t>
+      </w:r>
+    </w:p>
+    <w:p>
+      <w:pPr>
+        <w:pStyle w:val="BodyText"/>
+        <w:bidi w:val="0"/>
+        <w:jc w:val="left"/>
+        <w:rPr/>
+      </w:pPr>
+      <w:r>
+        <w:rPr/>
+        <w:t xml:space="preserve">Search for </w:t>
+      </w:r>
+      <w:r>
+        <w:rPr>
+          <w:rFonts w:ascii="Liberation Mono" w:hAnsi="Liberation Mono"/>
+        </w:rPr>
+        <w:t>class Asiento|DbSet&lt;.*Asiento</w:t>
+      </w:r>
+    </w:p>
+    <w:p>
+      <w:pPr>
+        <w:pStyle w:val="BodyText"/>
+        <w:bidi w:val="0"/>
+        <w:jc w:val="left"/>
+        <w:rPr/>
+      </w:pPr>
+      <w:r>
+        <w:rPr/>
+        <w:t>Read Completed with input: { "path": "D:\GMS\Jerry\OilsMexico\src\OilsMexico.Domain\Entities\AsientoContable.cs" }</w:t>
+      </w:r>
+    </w:p>
+    <w:p>
+      <w:pPr>
+        <w:pStyle w:val="BodyText"/>
+        <w:bidi w:val="0"/>
+        <w:jc w:val="left"/>
+        <w:rPr/>
+      </w:pPr>
+      <w:r>
+        <w:rPr/>
+        <w:t>Edit</w:t>
+      </w:r>
+    </w:p>
+    <w:p>
+      <w:pPr>
+        <w:pStyle w:val="BodyText"/>
+        <w:bidi w:val="0"/>
+        <w:jc w:val="left"/>
+        <w:rPr/>
+      </w:pPr>
+      <w:r>
+        <w:rPr/>
+        <w:t>Edit</w:t>
+      </w:r>
+    </w:p>
+    <w:p>
+      <w:pPr>
+        <w:pStyle w:val="BodyText"/>
+        <w:bidi w:val="0"/>
+        <w:jc w:val="left"/>
+        <w:rPr/>
+      </w:pPr>
+      <w:r>
+        <w:rPr/>
+        <w:t>Read Completed with input: { "path": "D:\GMS\Jerry\OilsMexico\src\OilsMexico.Application\DTOs\FiscalCajaDtos.cs" }</w:t>
+      </w:r>
+    </w:p>
+    <w:p>
+      <w:pPr>
+        <w:pStyle w:val="BodyText"/>
+        <w:bidi w:val="0"/>
+        <w:jc w:val="left"/>
+        <w:rPr/>
+      </w:pPr>
+      <w:r>
+        <w:rPr/>
+        <w:t xml:space="preserve">Search for </w:t>
+      </w:r>
+      <w:r>
+        <w:rPr>
+          <w:rFonts w:ascii="Liberation Mono" w:hAnsi="Liberation Mono"/>
+        </w:rPr>
+        <w:t>record CerrarCorteRequest|record CorteResult</w:t>
+      </w:r>
+    </w:p>
+    <w:p>
+      <w:pPr>
+        <w:pStyle w:val="BodyText"/>
+        <w:bidi w:val="0"/>
+        <w:jc w:val="left"/>
+        <w:rPr/>
+      </w:pPr>
+      <w:r>
+        <w:rPr/>
+        <w:t>Read Completed with input: { "path": "D:\GMS\Jerry\OilsMexico\global.json" }</w:t>
+      </w:r>
+    </w:p>
+    <w:p>
+      <w:pPr>
+        <w:pStyle w:val="BodyText"/>
+        <w:bidi w:val="0"/>
+        <w:jc w:val="left"/>
+        <w:rPr/>
+      </w:pPr>
+      <w:r>
+        <w:rPr/>
+        <w:t>Read Completed with input: { "path": "D:\GMS\Jerry\OilsMexico\tests\OilsMexico.IntegrationTests\OilsMexico.IntegrationTests.csproj" }</w:t>
+      </w:r>
+    </w:p>
+    <w:p>
+      <w:pPr>
+        <w:pStyle w:val="BodyText"/>
+        <w:bidi w:val="0"/>
+        <w:jc w:val="left"/>
+        <w:rPr/>
+      </w:pPr>
+      <w:r>
+        <w:rPr/>
+        <w:t>"Read" failed Completed with input: { "path": "D:\GMS\Jerry\OilsMexico\Directory.Build.props" } Tool execution failed: Path does not exist</w:t>
+      </w:r>
+    </w:p>
+    <w:p>
+      <w:pPr>
+        <w:pStyle w:val="BodyText"/>
+        <w:bidi w:val="0"/>
+        <w:jc w:val="left"/>
+        <w:rPr/>
+      </w:pPr>
+      <w:r>
+        <w:rPr/>
+        <w:t xml:space="preserve">Find files matching </w:t>
+      </w:r>
+      <w:r>
+        <w:rPr>
+          <w:rFonts w:ascii="Liberation Mono" w:hAnsi="Liberation Mono"/>
+        </w:rPr>
+        <w:t>Directory.Packages.props</w:t>
+      </w:r>
+    </w:p>
+    <w:p>
+      <w:pPr>
+        <w:pStyle w:val="BodyText"/>
+        <w:bidi w:val="0"/>
+        <w:jc w:val="left"/>
+        <w:rPr/>
+      </w:pPr>
+      <w:r>
+        <w:rPr/>
+        <w:t>"Read" failed Completed with input: { "path": "D:\GMS\Jerry\OilsMexico\src\OilsMexico.Application\Interfaces\Contabilidad.cs", "view_range": [ 1, 80 ] } Tool execution failed: Path does not exist</w:t>
+      </w:r>
+    </w:p>
+    <w:p>
+      <w:pPr>
+        <w:pStyle w:val="BodyText"/>
+        <w:bidi w:val="0"/>
+        <w:jc w:val="left"/>
+        <w:rPr/>
+      </w:pPr>
+      <w:r>
+        <w:rPr/>
+        <w:t xml:space="preserve">Search for </w:t>
+      </w:r>
+      <w:r>
+        <w:rPr>
+          <w:rFonts w:ascii="Liberation Mono" w:hAnsi="Liberation Mono"/>
+        </w:rPr>
+        <w:t>interface ICierreContableService</w:t>
+      </w:r>
+    </w:p>
+    <w:p>
+      <w:pPr>
+        <w:pStyle w:val="BodyText"/>
+        <w:bidi w:val="0"/>
+        <w:jc w:val="left"/>
+        <w:rPr/>
+      </w:pPr>
+      <w:r>
+        <w:rPr/>
+        <w:t>Read , lines 345 to 375 Completed with input: { "path": "D:\GMS\Jerry\OilsMexico\src\OilsMexico.Application\Interfaces\Servicios.cs", "view_range": [ 345, 375 ] }</w:t>
+      </w:r>
+    </w:p>
+    <w:p>
+      <w:pPr>
+        <w:pStyle w:val="BodyText"/>
+        <w:bidi w:val="0"/>
+        <w:jc w:val="left"/>
+        <w:rPr/>
+      </w:pPr>
+      <w:r>
+        <w:rPr/>
+        <w:t xml:space="preserve">Search for </w:t>
+      </w:r>
+      <w:r>
+        <w:rPr>
+          <w:rFonts w:ascii="Liberation Mono" w:hAnsi="Liberation Mono"/>
+        </w:rPr>
+        <w:t>record PeriodoContableDto|record CierreContableResultDto</w:t>
+      </w:r>
+    </w:p>
+    <w:p>
+      <w:pPr>
+        <w:pStyle w:val="BodyText"/>
+        <w:bidi w:val="0"/>
+        <w:jc w:val="left"/>
+        <w:rPr/>
+      </w:pPr>
+      <w:r>
+        <w:rPr/>
+        <w:t>Read , lines 40 to 55 Completed with input: { "path": "D:\GMS\Jerry\OilsMexico\src\OilsMexico.Application\DTOs\CuentaContableDtos.cs", "view_range": [ 40, 55 ] }</w:t>
+      </w:r>
+    </w:p>
+    <w:p>
+      <w:pPr>
+        <w:pStyle w:val="BodyText"/>
+        <w:bidi w:val="0"/>
+        <w:jc w:val="left"/>
+        <w:rPr/>
+      </w:pPr>
+      <w:r>
+        <w:rPr/>
+        <w:t>Edit</w:t>
+      </w:r>
+    </w:p>
+    <w:p>
+      <w:pPr>
+        <w:pStyle w:val="BodyText"/>
+        <w:bidi w:val="0"/>
+        <w:jc w:val="left"/>
+        <w:rPr/>
+      </w:pPr>
+      <w:r>
+        <w:rPr/>
+        <w:t>Discovering tests... Tool execution failed: No tests found in the files</w:t>
+      </w:r>
+    </w:p>
+    <w:p>
+      <w:pPr>
+        <w:pStyle w:val="BodyText"/>
+        <w:bidi w:val="0"/>
+        <w:jc w:val="left"/>
+        <w:rPr/>
+      </w:pPr>
+      <w:r>
+        <w:rPr/>
+        <w:t>Ran terminal command: dotnet --version; dotnet test .\tests\OilsMexico.IntegrationTests\OilsMexico.IntegrationTests.csproj --filter "FullyQualifiedName~AuditoriaTests" Tool execution failed with exit code 1</w:t>
+      </w:r>
+    </w:p>
+    <w:p>
+      <w:pPr>
+        <w:pStyle w:val="BodyText"/>
+        <w:bidi w:val="0"/>
+        <w:jc w:val="left"/>
+        <w:rPr/>
+      </w:pPr>
+      <w:r>
+        <w:rPr/>
+        <w:t xml:space="preserve">Search for </w:t>
+      </w:r>
+      <w:r>
+        <w:rPr>
+          <w:rFonts w:ascii="Liberation Mono" w:hAnsi="Liberation Mono"/>
+        </w:rPr>
+        <w:t>error |Error|failed|Failed|warning</w:t>
+      </w:r>
+    </w:p>
+    <w:p>
+      <w:pPr>
+        <w:pStyle w:val="BodyText"/>
+        <w:bidi w:val="0"/>
+        <w:jc w:val="left"/>
+        <w:rPr/>
+      </w:pPr>
+      <w:r>
+        <w:rPr/>
+        <w:t>Ran terminal command: git --no-pager diff --check; git status --short</w:t>
+      </w:r>
+    </w:p>
+    <w:p>
+      <w:pPr>
+        <w:pStyle w:val="BodyText"/>
+        <w:bidi w:val="0"/>
+        <w:jc w:val="left"/>
+        <w:rPr/>
+      </w:pPr>
+      <w:r>
+        <w:rPr/>
+        <w:t>Read tool output Completed with input: { "path": "C:\Users\usuario\AppData\Local\Temp\1792089070633-copilot-tool-output-25432-c9411119-be08-4104-ab92-55bf27001e6a.txt", "view_range": [ 1, 50 ] }</w:t>
+      </w:r>
+    </w:p>
+    <w:p>
+      <w:pPr>
+        <w:pStyle w:val="BodyText"/>
+        <w:bidi w:val="0"/>
+        <w:jc w:val="left"/>
+        <w:rPr/>
+      </w:pPr>
+      <w:r>
+        <w:rPr/>
+        <w:t>Read Completed with input: { "path": "D:\GMS\Jerry\OilsMexico\src\OilsMexico.Infrastructure\Services\VentasService.Estados.cs" }</w:t>
+      </w:r>
+    </w:p>
+    <w:p>
+      <w:pPr>
+        <w:pStyle w:val="BodyText"/>
+        <w:bidi w:val="0"/>
+        <w:jc w:val="left"/>
+        <w:rPr/>
+      </w:pPr>
+      <w:r>
+        <w:rPr/>
+        <w:t>Edit</w:t>
+      </w:r>
+    </w:p>
+    <w:p>
+      <w:pPr>
+        <w:pStyle w:val="BodyText"/>
+        <w:bidi w:val="0"/>
+        <w:jc w:val="left"/>
+        <w:rPr/>
+      </w:pPr>
+      <w:r>
+        <w:rPr/>
+        <w:t>Ran terminal command: dotnet test .\tests\OilsMexico.IntegrationTests\OilsMexico.IntegrationTests.csproj --filter "FullyQualifiedName~AuditoriaTests"</w:t>
+      </w:r>
+    </w:p>
+    <w:p>
+      <w:pPr>
+        <w:pStyle w:val="BodyText"/>
+        <w:bidi w:val="0"/>
+        <w:jc w:val="left"/>
+        <w:rPr/>
+      </w:pPr>
+      <w:r>
+        <w:rPr/>
+        <w:t xml:space="preserve">Search for </w:t>
+      </w:r>
+      <w:r>
+        <w:rPr>
+          <w:rFonts w:ascii="Liberation Mono" w:hAnsi="Liberation Mono"/>
+        </w:rPr>
+        <w:t xml:space="preserve">Passed|Failed|Error|Total tests|error CS|error </w:t>
+      </w:r>
+    </w:p>
+    <w:p>
+      <w:pPr>
+        <w:pStyle w:val="BodyText"/>
+        <w:bidi w:val="0"/>
+        <w:jc w:val="left"/>
+        <w:rPr/>
+      </w:pPr>
+      <w:r>
+        <w:rPr/>
+        <w:t>Read tool output Completed with input: { "path": "C:\Users\usuario\AppData\Local\Temp\1792089124369-copilot-tool-output-25432-d6517628-d2e7-4e87-9c49-3acc996bbda8.txt", "view_range": [ 40, 80 ] }</w:t>
+      </w:r>
+    </w:p>
+    <w:p>
+      <w:pPr>
+        <w:pStyle w:val="BodyText"/>
+        <w:bidi w:val="0"/>
+        <w:jc w:val="left"/>
+        <w:rPr/>
+      </w:pPr>
+      <w:r>
+        <w:rPr/>
+        <w:t>Los cambios enfocados ya compilan y pasaron las pruebas de auditoría. También corregí un error de compilación que estaba en la implementación previa (faltaba importar la regla de periodo en ventas); ahora verificaré las pruebas contables y de integración pertinentes.</w:t>
+      </w:r>
+    </w:p>
+    <w:p>
+      <w:pPr>
+        <w:pStyle w:val="BodyText"/>
+        <w:bidi w:val="0"/>
+        <w:jc w:val="left"/>
+        <w:rPr/>
+      </w:pPr>
+      <w:r>
+        <w:rPr/>
+        <w:t>Ran terminal command: dotnet test .\tests\OilsMexico.IntegrationTests\OilsMexico.IntegrationTests.csproj --filter "FullyQualifiedName~CierreContableTests"</w:t>
+      </w:r>
+    </w:p>
+    <w:p>
+      <w:pPr>
+        <w:pStyle w:val="BodyText"/>
+        <w:bidi w:val="0"/>
+        <w:jc w:val="left"/>
+        <w:rPr/>
+      </w:pPr>
+      <w:r>
+        <w:rPr/>
+        <w:t>Ran terminal command: dotnet test .\tests\OilsMexico.IntegrationTests\OilsMexico.IntegrationTests.csproj --filter "FullyQualifiedName~PostgresP1Tests"</w:t>
+      </w:r>
+    </w:p>
+    <w:p>
+      <w:pPr>
+        <w:pStyle w:val="BodyText"/>
+        <w:bidi w:val="0"/>
+        <w:jc w:val="left"/>
+        <w:rPr/>
+      </w:pPr>
+      <w:r>
+        <w:rPr/>
+        <w:t>Read , lines 290 to 355 Completed with input: { "path": "D:\GMS\Jerry\OilsMexico\src\OilsMexico.Infrastructure\Services\AuthService.cs", "view_range": [ 290, 355 ] }</w:t>
+      </w:r>
+    </w:p>
+    <w:p>
+      <w:pPr>
+        <w:pStyle w:val="BodyText"/>
+        <w:bidi w:val="0"/>
+        <w:jc w:val="left"/>
+        <w:rPr/>
+      </w:pPr>
+      <w:r>
+        <w:rPr/>
+        <w:t xml:space="preserve">Search for </w:t>
+      </w:r>
+      <w:r>
+        <w:rPr>
+          <w:rFonts w:ascii="Liberation Mono" w:hAnsi="Liberation Mono"/>
+        </w:rPr>
+        <w:t>ReglaPeriodoCerrado|EstaCerradoAsync</w:t>
+      </w:r>
+    </w:p>
+    <w:p>
+      <w:pPr>
+        <w:pStyle w:val="BodyText"/>
+        <w:bidi w:val="0"/>
+        <w:jc w:val="left"/>
+        <w:rPr/>
+      </w:pPr>
+      <w:r>
+        <w:rPr/>
+        <w:t xml:space="preserve">Search for </w:t>
+      </w:r>
+      <w:r>
+        <w:rPr>
+          <w:rFonts w:ascii="Liberation Mono" w:hAnsi="Liberation Mono"/>
+        </w:rPr>
+        <w:t>RegistrarAuditoria\(|AuditLogs.Add</w:t>
+      </w:r>
+    </w:p>
+    <w:p>
+      <w:pPr>
+        <w:pStyle w:val="BodyText"/>
+        <w:bidi w:val="0"/>
+        <w:jc w:val="left"/>
+        <w:rPr/>
+      </w:pPr>
+      <w:r>
+        <w:rPr/>
+        <w:t xml:space="preserve">Search for </w:t>
+      </w:r>
+      <w:r>
+        <w:rPr>
+          <w:rFonts w:ascii="Liberation Mono" w:hAnsi="Liberation Mono"/>
+        </w:rPr>
+        <w:t>new .*Service\(db, ctx\)|new CatalogosService</w:t>
+      </w:r>
+    </w:p>
+    <w:p>
+      <w:pPr>
+        <w:pStyle w:val="BodyText"/>
+        <w:bidi w:val="0"/>
+        <w:jc w:val="left"/>
+        <w:rPr/>
+      </w:pPr>
+      <w:r>
+        <w:rPr/>
+        <w:t>Read , lines 84 to 110 Completed with input: { "path": "D:\GMS\Jerry\OilsMexico\Por realizar 15 de octubre.md", "view_range": [ 84, 110 ] }</w:t>
+      </w:r>
+    </w:p>
+    <w:p>
+      <w:pPr>
+        <w:pStyle w:val="BodyText"/>
+        <w:bidi w:val="0"/>
+        <w:jc w:val="left"/>
+        <w:rPr/>
+      </w:pPr>
+      <w:r>
+        <w:rPr/>
+        <w:t xml:space="preserve">Search for </w:t>
+      </w:r>
+      <w:r>
+        <w:rPr>
+          <w:rFonts w:ascii="Liberation Mono" w:hAnsi="Liberation Mono"/>
+        </w:rPr>
+        <w:t>void RegistrarAuditLog|RegistrarAuditLog\(</w:t>
+      </w:r>
+    </w:p>
+    <w:p>
+      <w:pPr>
+        <w:pStyle w:val="BodyText"/>
+        <w:bidi w:val="0"/>
+        <w:jc w:val="left"/>
+        <w:rPr/>
+      </w:pPr>
+      <w:r>
+        <w:rPr/>
+        <w:t>Read , lines 488 to 515 Completed with input: { "path": "D:\GMS\Jerry\OilsMexico\src\OilsMexico.Infrastructure\Services\AuthService.cs", "view_range": [ 488, 515 ] }</w:t>
+      </w:r>
+    </w:p>
+    <w:p>
+      <w:pPr>
+        <w:pStyle w:val="BodyText"/>
+        <w:bidi w:val="0"/>
+        <w:jc w:val="left"/>
+        <w:rPr/>
+      </w:pPr>
+      <w:r>
+        <w:rPr/>
+        <w:t xml:space="preserve">Search for </w:t>
+      </w:r>
+      <w:r>
+        <w:rPr>
+          <w:rFonts w:ascii="Liberation Mono" w:hAnsi="Liberation Mono"/>
+        </w:rPr>
+        <w:t>GuardarPasswordConfigAsync</w:t>
+      </w:r>
+    </w:p>
+    <w:p>
+      <w:pPr>
+        <w:pStyle w:val="BodyText"/>
+        <w:bidi w:val="0"/>
+        <w:jc w:val="left"/>
+        <w:rPr/>
+      </w:pPr>
+      <w:r>
+        <w:rPr/>
+        <w:t>Edit</w:t>
+      </w:r>
+    </w:p>
+    <w:p>
+      <w:pPr>
+        <w:pStyle w:val="BodyText"/>
+        <w:bidi w:val="0"/>
+        <w:jc w:val="left"/>
+        <w:rPr/>
+      </w:pPr>
+      <w:r>
+        <w:rPr/>
+        <w:t>Edit</w:t>
+      </w:r>
+    </w:p>
+    <w:p>
+      <w:pPr>
+        <w:pStyle w:val="BodyText"/>
+        <w:bidi w:val="0"/>
+        <w:jc w:val="left"/>
+        <w:rPr/>
+      </w:pPr>
+      <w:r>
+        <w:rPr/>
+        <w:t>Edit</w:t>
+      </w:r>
+    </w:p>
+    <w:p>
+      <w:pPr>
+        <w:pStyle w:val="BodyText"/>
+        <w:bidi w:val="0"/>
+        <w:jc w:val="left"/>
+        <w:rPr/>
+      </w:pPr>
+      <w:r>
+        <w:rPr/>
+        <w:t>Ran terminal command: dotnet test .\tests\OilsMexico.IntegrationTests\OilsMexico.IntegrationTests.csproj --filter "FullyQualifiedName~AuditoriaTests"</w:t>
+      </w:r>
+    </w:p>
+    <w:p>
+      <w:pPr>
+        <w:pStyle w:val="BodyText"/>
+        <w:bidi w:val="0"/>
+        <w:jc w:val="left"/>
+        <w:rPr/>
+      </w:pPr>
+      <w:r>
+        <w:rPr/>
+        <w:t>Ran terminal command: dotnet build .\src\OilsMexico.Web\OilsMexico.Web.csproj --no-restore</w:t>
+      </w:r>
+    </w:p>
+    <w:p>
+      <w:pPr>
+        <w:pStyle w:val="BodyText"/>
+        <w:bidi w:val="0"/>
+        <w:jc w:val="left"/>
+        <w:rPr/>
+      </w:pPr>
+      <w:r>
+        <w:rPr/>
+        <w:t>Ran terminal command: git --no-pager diff --check; git --no-pager diff --stat</w:t>
+      </w:r>
+    </w:p>
+    <w:p>
+      <w:pPr>
+        <w:pStyle w:val="BodyText"/>
+        <w:bidi w:val="0"/>
+        <w:jc w:val="left"/>
+        <w:rPr/>
+      </w:pPr>
+      <w:r>
+        <w:rPr/>
+        <w:t xml:space="preserve">Search for </w:t>
+      </w:r>
+      <w:r>
+        <w:rPr>
+          <w:rFonts w:ascii="Liberation Mono" w:hAnsi="Liberation Mono"/>
+        </w:rPr>
+        <w:t>Correctas!|Con error|error CS|error NET|Build succeeded|Compilación correcta|...</w:t>
+      </w:r>
+    </w:p>
+    <w:p>
+      <w:pPr>
+        <w:pStyle w:val="BodyText"/>
+        <w:bidi w:val="0"/>
+        <w:jc w:val="left"/>
+        <w:rPr/>
+      </w:pPr>
+      <w:r>
+        <w:rPr/>
+        <w:t xml:space="preserve">Search for </w:t>
+      </w:r>
+      <w:r>
+        <w:rPr>
+          <w:rFonts w:ascii="Liberation Mono" w:hAnsi="Liberation Mono"/>
+        </w:rPr>
+        <w:t>Build succeeded|Compilación correcta|error CS|error NET|Error(es)?</w:t>
+      </w:r>
+    </w:p>
+    <w:p>
+      <w:pPr>
+        <w:pStyle w:val="BodyText"/>
+        <w:bidi w:val="0"/>
+        <w:jc w:val="left"/>
+        <w:rPr/>
+      </w:pPr>
+      <w:r>
+        <w:rPr/>
+        <w:t xml:space="preserve">Search for </w:t>
+      </w:r>
+      <w:r>
+        <w:rPr>
+          <w:rFonts w:ascii="Liberation Mono" w:hAnsi="Liberation Mono"/>
+        </w:rPr>
+        <w:t>EliminarAsync\(|EliminarGasto|GastosService.*Eliminar</w:t>
+      </w:r>
+    </w:p>
+    <w:p>
+      <w:pPr>
+        <w:pStyle w:val="BodyText"/>
+        <w:bidi w:val="0"/>
+        <w:jc w:val="left"/>
+        <w:rPr/>
+      </w:pPr>
+      <w:r>
+        <w:rPr/>
+        <w:t>Edit</w:t>
+      </w:r>
+    </w:p>
+    <w:p>
+      <w:pPr>
+        <w:pStyle w:val="BodyText"/>
+        <w:bidi w:val="0"/>
+        <w:jc w:val="left"/>
+        <w:rPr/>
+      </w:pPr>
+      <w:r>
+        <w:rPr/>
+        <w:t>Edit</w:t>
+      </w:r>
+    </w:p>
+    <w:p>
+      <w:pPr>
+        <w:pStyle w:val="BodyText"/>
+        <w:bidi w:val="0"/>
+        <w:jc w:val="left"/>
+        <w:rPr/>
+      </w:pPr>
+      <w:r>
+        <w:rPr/>
+        <w:t xml:space="preserve">Search for </w:t>
+      </w:r>
+      <w:r>
+        <w:rPr>
+          <w:rFonts w:ascii="Liberation Mono" w:hAnsi="Liberation Mono"/>
+        </w:rPr>
+        <w:t>GastoService|GastoCreado|GastoActualizado|GastoEliminado</w:t>
+      </w:r>
+    </w:p>
+    <w:p>
+      <w:pPr>
+        <w:pStyle w:val="BodyText"/>
+        <w:bidi w:val="0"/>
+        <w:jc w:val="left"/>
+        <w:rPr/>
+      </w:pPr>
+      <w:r>
+        <w:rPr/>
+        <w:t xml:space="preserve">Search for </w:t>
+      </w:r>
+      <w:r>
+        <w:rPr>
+          <w:rFonts w:ascii="Liberation Mono" w:hAnsi="Liberation Mono"/>
+        </w:rPr>
+        <w:t>record CrearGastoRequest</w:t>
+      </w:r>
+    </w:p>
+    <w:p>
+      <w:pPr>
+        <w:pStyle w:val="BodyText"/>
+        <w:bidi w:val="0"/>
+        <w:jc w:val="left"/>
+        <w:rPr/>
+      </w:pPr>
+      <w:r>
+        <w:rPr/>
+        <w:t>Read , lines 1 to 30 Completed with input: { "path": "D:\GMS\Jerry\OilsMexico\src\OilsMexico.Application\DTOs\GastoDtos.cs", "view_range": [ 1, 30 ] }</w:t>
+      </w:r>
+    </w:p>
+    <w:p>
+      <w:pPr>
+        <w:pStyle w:val="BodyText"/>
+        <w:bidi w:val="0"/>
+        <w:jc w:val="left"/>
+        <w:rPr/>
+      </w:pPr>
+      <w:r>
+        <w:rPr/>
+        <w:t xml:space="preserve">Search for </w:t>
+      </w:r>
+      <w:r>
+        <w:rPr>
+          <w:rFonts w:ascii="Liberation Mono" w:hAnsi="Liberation Mono"/>
+        </w:rPr>
+        <w:t>enum CategoriaGasto</w:t>
+      </w:r>
+    </w:p>
+    <w:p>
+      <w:pPr>
+        <w:pStyle w:val="BodyText"/>
+        <w:bidi w:val="0"/>
+        <w:jc w:val="left"/>
+        <w:rPr/>
+      </w:pPr>
+      <w:r>
+        <w:rPr/>
+        <w:t>Read , lines 151 to 162 Completed with input: { "path": "D:\GMS\Jerry\OilsMexico\src\OilsMexico.Domain\Enums\ErpEnums.cs", "view_range": [ 151, 162 ] }</w:t>
+      </w:r>
+    </w:p>
+    <w:p>
+      <w:pPr>
+        <w:pStyle w:val="BodyText"/>
+        <w:bidi w:val="0"/>
+        <w:jc w:val="left"/>
+        <w:rPr/>
+      </w:pPr>
+      <w:r>
+        <w:rPr/>
+        <w:t>Edit</w:t>
+      </w:r>
+    </w:p>
+    <w:p>
+      <w:pPr>
+        <w:pStyle w:val="BodyText"/>
+        <w:bidi w:val="0"/>
+        <w:jc w:val="left"/>
+        <w:rPr/>
+      </w:pPr>
+      <w:r>
+        <w:rPr/>
+        <w:t>Ran terminal command: dotnet test .\tests\OilsMexico.IntegrationTests\OilsMexico.IntegrationTests.csproj --filter "FullyQualifiedName~AuditoriaTests"</w:t>
+      </w:r>
+    </w:p>
+    <w:p>
+      <w:pPr>
+        <w:pStyle w:val="BodyText"/>
+        <w:bidi w:val="0"/>
+        <w:jc w:val="left"/>
+        <w:rPr/>
+      </w:pPr>
+      <w:r>
+        <w:rPr/>
+        <w:t xml:space="preserve">Search for </w:t>
+      </w:r>
+      <w:r>
+        <w:rPr>
+          <w:rFonts w:ascii="Liberation Mono" w:hAnsi="Liberation Mono"/>
+        </w:rPr>
+        <w:t>Correctas!|error CS|Fallidas:|Failed</w:t>
+      </w:r>
+    </w:p>
+    <w:p>
+      <w:pPr>
+        <w:pStyle w:val="BodyText"/>
+        <w:bidi w:val="0"/>
+        <w:jc w:val="left"/>
+        <w:rPr/>
+      </w:pPr>
+      <w:r>
+        <w:rPr/>
+        <w:t>Ran terminal command: dotnet test .\tests\OilsMexico.IntegrationTests\OilsMexico.IntegrationTests.csproj --filter "FullyQualifiedName~CierreContableTests"</w:t>
+      </w:r>
+    </w:p>
+    <w:p>
+      <w:pPr>
+        <w:pStyle w:val="BodyText"/>
+        <w:bidi w:val="0"/>
+        <w:jc w:val="left"/>
+        <w:rPr/>
+      </w:pPr>
+      <w:r>
+        <w:rPr/>
+        <w:t>Ran terminal command: dotnet test .\tests\OilsMexico.IntegrationTests\OilsMexico.IntegrationTests.csproj --filter "FullyQualifiedName~PostgresP1Tests"</w:t>
+      </w:r>
+    </w:p>
+    <w:p>
+      <w:pPr>
+        <w:pStyle w:val="BodyText"/>
+        <w:bidi w:val="0"/>
+        <w:jc w:val="left"/>
+        <w:rPr/>
+      </w:pPr>
+      <w:r>
+        <w:rPr/>
+        <w:t>Ran terminal command: dotnet build .\src\OilsMexico.Web\OilsMexico.Web.csproj --no-restore</w:t>
+      </w:r>
+    </w:p>
+    <w:p>
+      <w:pPr>
+        <w:pStyle w:val="BodyText"/>
+        <w:bidi w:val="0"/>
+        <w:jc w:val="left"/>
+        <w:rPr/>
+      </w:pPr>
+      <w:r>
+        <w:rPr/>
+        <w:t>Edit</w:t>
+      </w:r>
+    </w:p>
+    <w:p>
+      <w:pPr>
+        <w:pStyle w:val="BodyText"/>
+        <w:bidi w:val="0"/>
+        <w:jc w:val="left"/>
+        <w:rPr/>
+      </w:pPr>
+      <w:r>
+        <w:rPr/>
+        <w:t>Read , lines 160 to 245 Completed with input: { "path": "D:\GMS\Jerry\OilsMexico\src\OilsMexico.Infrastructure\Services\CatalogosService.cs", "view_range": [ 160, 245 ] }</w:t>
+      </w:r>
+    </w:p>
+    <w:p>
+      <w:pPr>
+        <w:pStyle w:val="BodyText"/>
+        <w:bidi w:val="0"/>
+        <w:jc w:val="left"/>
+        <w:rPr/>
+      </w:pPr>
+      <w:r>
+        <w:rPr/>
+        <w:t>Edit</w:t>
+      </w:r>
+    </w:p>
+    <w:p>
+      <w:pPr>
+        <w:pStyle w:val="BodyText"/>
+        <w:bidi w:val="0"/>
+        <w:jc w:val="left"/>
+        <w:rPr/>
+      </w:pPr>
+      <w:r>
+        <w:rPr/>
+        <w:t>Edit</w:t>
+      </w:r>
+    </w:p>
+    <w:p>
+      <w:pPr>
+        <w:pStyle w:val="BodyText"/>
+        <w:bidi w:val="0"/>
+        <w:jc w:val="left"/>
+        <w:rPr/>
+      </w:pPr>
+      <w:r>
+        <w:rPr/>
+        <w:t>Edit</w:t>
+      </w:r>
+    </w:p>
+    <w:p>
+      <w:pPr>
+        <w:pStyle w:val="BodyText"/>
+        <w:bidi w:val="0"/>
+        <w:jc w:val="left"/>
+        <w:rPr/>
+      </w:pPr>
+      <w:r>
+        <w:rPr/>
+        <w:t>Ran terminal command: dotnet test .\tests\OilsMexico.IntegrationTests\OilsMexico.IntegrationTests.csproj --filter "FullyQualifiedName~AuditoriaTests"</w:t>
+      </w:r>
+    </w:p>
+    <w:p>
+      <w:pPr>
+        <w:pStyle w:val="BodyText"/>
+        <w:bidi w:val="0"/>
+        <w:jc w:val="left"/>
+        <w:rPr/>
+      </w:pPr>
+      <w:r>
+        <w:rPr/>
+        <w:t>Ran terminal command: dotnet build .\src\OilsMexico.Web\OilsMexico.Web.csproj --no-restore</w:t>
+      </w:r>
+    </w:p>
+    <w:p>
+      <w:pPr>
+        <w:pStyle w:val="BodyText"/>
+        <w:bidi w:val="0"/>
+        <w:jc w:val="left"/>
+        <w:rPr/>
+      </w:pPr>
+      <w:r>
+        <w:rPr/>
+        <w:t>Ran terminal command: git --no-pager diff --check; git status --short</w:t>
+      </w:r>
+    </w:p>
+    <w:p>
+      <w:pPr>
+        <w:pStyle w:val="BodyText"/>
+        <w:bidi w:val="0"/>
+        <w:jc w:val="left"/>
+        <w:rPr/>
+      </w:pPr>
+      <w:r>
+        <w:rPr/>
+        <w:t xml:space="preserve">Search for </w:t>
+      </w:r>
+      <w:r>
+        <w:rPr>
+          <w:rFonts w:ascii="Liberation Mono" w:hAnsi="Liberation Mono"/>
+        </w:rPr>
+        <w:t>Compilación correcta|0 Errores|error CS|error NET</w:t>
+      </w:r>
+    </w:p>
+    <w:p>
+      <w:pPr>
+        <w:pStyle w:val="BodyText"/>
+        <w:bidi w:val="0"/>
+        <w:jc w:val="left"/>
+        <w:rPr/>
+      </w:pPr>
+      <w:r>
+        <w:rPr/>
+        <w:t>Edit</w:t>
+      </w:r>
+    </w:p>
+    <w:p>
+      <w:pPr>
+        <w:pStyle w:val="BodyText"/>
+        <w:bidi w:val="0"/>
+        <w:jc w:val="left"/>
+        <w:rPr/>
+      </w:pPr>
+      <w:r>
+        <w:rPr/>
+        <w:t>Ya quedó registrada la política y el estado de validación en el checklist. Estoy haciendo la última pasada de pruebas contables y verificando que el diff final no tenga errores de formato.</w:t>
+      </w:r>
+    </w:p>
+    <w:p>
+      <w:pPr>
+        <w:pStyle w:val="BodyText"/>
+        <w:bidi w:val="0"/>
+        <w:jc w:val="left"/>
+        <w:rPr/>
+      </w:pPr>
+      <w:r>
+        <w:rPr/>
+        <w:t>Ran terminal command: dotnet test .\tests\OilsMexico.IntegrationTests\OilsMexico.IntegrationTests.csproj --filter "FullyQualifiedName~CierreContableTests|FullyQualifiedName~PostgresP1Tests"</w:t>
+      </w:r>
+    </w:p>
+    <w:p>
+      <w:pPr>
+        <w:pStyle w:val="BodyText"/>
+        <w:bidi w:val="0"/>
+        <w:jc w:val="left"/>
+        <w:rPr/>
+      </w:pPr>
+      <w:r>
+        <w:rPr/>
+        <w:t>Ran terminal command: git --no-pager diff --check; git --no-pager diff --stat</w:t>
+      </w:r>
+    </w:p>
+    <w:p>
+      <w:pPr>
+        <w:pStyle w:val="BodyText"/>
+        <w:bidi w:val="0"/>
+        <w:jc w:val="left"/>
+        <w:rPr/>
+      </w:pPr>
+      <w:r>
+        <w:rPr/>
+        <w:t xml:space="preserve">Search for </w:t>
+      </w:r>
+      <w:r>
+        <w:rPr>
+          <w:rFonts w:ascii="Liberation Mono" w:hAnsi="Liberation Mono"/>
+        </w:rPr>
+        <w:t>RegistrarAuditoria\(|AuditLogs.Add</w:t>
+      </w:r>
+    </w:p>
+    <w:p>
+      <w:pPr>
+        <w:pStyle w:val="BodyText"/>
+        <w:bidi w:val="0"/>
+        <w:jc w:val="left"/>
+        <w:rPr/>
+      </w:pPr>
+      <w:r>
+        <w:rPr/>
+        <w:t>Edit</w:t>
+      </w:r>
+    </w:p>
+    <w:p>
+      <w:pPr>
+        <w:pStyle w:val="BodyText"/>
+        <w:bidi w:val="0"/>
+        <w:jc w:val="left"/>
+        <w:rPr/>
+      </w:pPr>
+      <w:r>
+        <w:rPr/>
+        <w:t>Edit</w:t>
+      </w:r>
+    </w:p>
+    <w:p>
+      <w:pPr>
+        <w:pStyle w:val="BodyText"/>
+        <w:bidi w:val="0"/>
+        <w:jc w:val="left"/>
+        <w:rPr/>
+      </w:pPr>
+      <w:r>
+        <w:rPr/>
+        <w:t>Edit</w:t>
+      </w:r>
+    </w:p>
+    <w:p>
+      <w:pPr>
+        <w:pStyle w:val="BodyText"/>
+        <w:bidi w:val="0"/>
+        <w:jc w:val="left"/>
+        <w:rPr/>
+      </w:pPr>
+      <w:r>
+        <w:rPr/>
+        <w:t>Edit</w:t>
+      </w:r>
+    </w:p>
+    <w:p>
+      <w:pPr>
+        <w:pStyle w:val="BodyText"/>
+        <w:bidi w:val="0"/>
+        <w:jc w:val="left"/>
+        <w:rPr/>
+      </w:pPr>
+      <w:r>
+        <w:rPr/>
+        <w:t>Edit</w:t>
+      </w:r>
+    </w:p>
+    <w:p>
+      <w:pPr>
+        <w:pStyle w:val="BodyText"/>
+        <w:bidi w:val="0"/>
+        <w:jc w:val="left"/>
+        <w:rPr/>
+      </w:pPr>
+      <w:r>
+        <w:rPr/>
+        <w:t>Edit</w:t>
+      </w:r>
+    </w:p>
+    <w:p>
+      <w:pPr>
+        <w:pStyle w:val="BodyText"/>
+        <w:bidi w:val="0"/>
+        <w:jc w:val="left"/>
+        <w:rPr/>
+      </w:pPr>
+      <w:r>
+        <w:rPr/>
+        <w:t>Ran terminal command: dotnet test .\tests\OilsMexico.IntegrationTests\OilsMexico.IntegrationTests.csproj --filter "FullyQualifiedName~AuditoriaTests|FullyQualifiedName~CierreContableTests|FullyQualifiedName~PostgresP1Tests"</w:t>
+      </w:r>
+    </w:p>
+    <w:p>
+      <w:pPr>
+        <w:pStyle w:val="BodyText"/>
+        <w:bidi w:val="0"/>
+        <w:jc w:val="left"/>
+        <w:rPr/>
+      </w:pPr>
+      <w:r>
+        <w:rPr/>
+        <w:t>Ran terminal command: dotnet build .\src\OilsMexico.Web\OilsMexico.Web.csproj --no-restore</w:t>
+      </w:r>
+    </w:p>
+    <w:p>
+      <w:pPr>
+        <w:pStyle w:val="BodyText"/>
+        <w:bidi w:val="0"/>
+        <w:jc w:val="left"/>
+        <w:rPr/>
+      </w:pPr>
+      <w:r>
+        <w:rPr/>
+        <w:t>Ran terminal command: git --no-pager diff --check</w:t>
+      </w:r>
+    </w:p>
+    <w:p>
+      <w:pPr>
+        <w:pStyle w:val="BodyText"/>
+        <w:bidi w:val="0"/>
+        <w:jc w:val="left"/>
+        <w:rPr/>
+      </w:pPr>
+      <w:r>
+        <w:rPr/>
+        <w:t xml:space="preserve">Search for </w:t>
+      </w:r>
+      <w:r>
+        <w:rPr>
+          <w:rFonts w:ascii="Liberation Mono" w:hAnsi="Liberation Mono"/>
+        </w:rPr>
+        <w:t>Correctas!|error CS|Fallidas:|Failed</w:t>
+      </w:r>
+    </w:p>
+    <w:p>
+      <w:pPr>
+        <w:pStyle w:val="BodyText"/>
+        <w:bidi w:val="0"/>
+        <w:jc w:val="left"/>
+        <w:rPr/>
+      </w:pPr>
+      <w:r>
+        <w:rPr/>
+        <w:t xml:space="preserve">Search for </w:t>
+      </w:r>
+      <w:r>
+        <w:rPr>
+          <w:rFonts w:ascii="Liberation Mono" w:hAnsi="Liberation Mono"/>
+        </w:rPr>
+        <w:t>Compilación correcta|0 Errores|error CS|error NET</w:t>
+      </w:r>
+    </w:p>
+    <w:p>
+      <w:pPr>
+        <w:pStyle w:val="BodyText"/>
+        <w:bidi w:val="0"/>
+        <w:jc w:val="left"/>
+        <w:rPr/>
+      </w:pPr>
+      <w:r>
+        <w:rPr/>
+        <w:t>Ran terminal command: git --no-pager diff --stat; git status --short</w:t>
+      </w:r>
+    </w:p>
+    <w:p>
+      <w:pPr>
+        <w:pStyle w:val="BodyText"/>
+        <w:bidi w:val="0"/>
+        <w:jc w:val="left"/>
+        <w:rPr/>
+      </w:pPr>
+      <w:r>
+        <w:rPr/>
+        <w:t>Read tool output Completed with input: { "path": "C:\Users\usuario\AppData\Local\Temp\1792089819669-copilot-tool-output-25432-a7a8257d-99a5-4aac-bd51-1b16a2c2e125.txt", "view_range": [ 35, 70 ] }</w:t>
+      </w:r>
+    </w:p>
+    <w:p>
+      <w:pPr>
+        <w:pStyle w:val="BodyText"/>
+        <w:bidi w:val="0"/>
+        <w:jc w:val="left"/>
+        <w:rPr/>
+      </w:pPr>
+      <w:r>
+        <w:rPr/>
+        <w:t>Read tool output Completed with input: { "path": "C:\Users\usuario\AppData\Local\Temp\1792089826901-copilot-tool-output-25432-e3a0ed70-97e3-494a-bd66-6d637a19aca4.txt", "view_range": [ 30, 80 ] }</w:t>
+      </w:r>
+    </w:p>
+    <w:p>
+      <w:pPr>
+        <w:pStyle w:val="BodyText"/>
+        <w:bidi w:val="0"/>
+        <w:jc w:val="left"/>
+        <w:rPr/>
+      </w:pPr>
+      <w:r>
+        <w:rPr/>
+        <w:t xml:space="preserve">Search for </w:t>
+      </w:r>
+      <w:r>
+        <w:rPr>
+          <w:rFonts w:ascii="Liberation Mono" w:hAnsi="Liberation Mono"/>
+        </w:rPr>
+        <w:t>Correctas!|Compilación correcta|0 Errores|Total:</w:t>
+      </w:r>
+    </w:p>
+    <w:p>
+      <w:pPr>
+        <w:pStyle w:val="BodyText"/>
+        <w:bidi w:val="0"/>
+        <w:jc w:val="left"/>
+        <w:rPr/>
+      </w:pPr>
+      <w:r>
+        <w:rPr/>
+        <w:t xml:space="preserve">Search for </w:t>
+      </w:r>
+      <w:r>
+        <w:rPr>
+          <w:rFonts w:ascii="Liberation Mono" w:hAnsi="Liberation Mono"/>
+        </w:rPr>
+        <w:t>Correctas!|Compilación correcta|0 Errores|Total:</w:t>
+      </w:r>
+    </w:p>
+    <w:p>
+      <w:pPr>
+        <w:pStyle w:val="BodyText"/>
+        <w:bidi w:val="0"/>
+        <w:jc w:val="left"/>
+        <w:rPr/>
+      </w:pPr>
+      <w:r>
+        <w:rPr/>
+        <w:t>Revisé la Prioridad 1 y corregí varias brechas de integridad y trazabilidad:</w:t>
+      </w:r>
+    </w:p>
+    <w:p>
+      <w:pPr>
+        <w:pStyle w:val="BodyText"/>
+        <w:numPr>
+          <w:ilvl w:val="0"/>
+          <w:numId w:val="6"/>
+        </w:numPr>
+        <w:tabs>
+          <w:tab w:val="clear" w:pos="709"/>
+          <w:tab w:val="left" w:pos="709" w:leader="none"/>
+        </w:tabs>
+        <w:bidi w:val="0"/>
+        <w:ind w:hanging="283" w:left="709"/>
+        <w:jc w:val="left"/>
+        <w:rPr/>
+      </w:pPr>
+      <w:r>
+        <w:rPr>
+          <w:b/>
+        </w:rPr>
+        <w:t>Periodos cerrados:</w:t>
+      </w:r>
+      <w:r>
+        <w:rPr/>
+        <w:t xml:space="preserve"> confirmé los filtros de sucursal de </w:t>
+      </w:r>
+      <w:r>
+        <w:rPr>
+          <w:rFonts w:ascii="Liberation Mono" w:hAnsi="Liberation Mono"/>
+        </w:rPr>
+        <w:t>ObtenerCotizacionAsync</w:t>
+      </w:r>
+      <w:r>
+        <w:rPr/>
+        <w:t xml:space="preserve"> y </w:t>
+      </w:r>
+      <w:r>
+        <w:rPr>
+          <w:rFonts w:ascii="Liberation Mono" w:hAnsi="Liberation Mono"/>
+        </w:rPr>
+        <w:t>ObtenerOrdenVentaAsync</w:t>
+      </w:r>
+      <w:r>
+        <w:rPr/>
+        <w:t>; ya restringían registros para usuarios no administradores. Extendí la regla de periodo cerrado a entradas manuales de inventario y a edición/eliminación de gastos.</w:t>
+      </w:r>
+    </w:p>
+    <w:p>
+      <w:pPr>
+        <w:pStyle w:val="BodyText"/>
+        <w:numPr>
+          <w:ilvl w:val="0"/>
+          <w:numId w:val="6"/>
+        </w:numPr>
+        <w:tabs>
+          <w:tab w:val="clear" w:pos="709"/>
+          <w:tab w:val="left" w:pos="709" w:leader="none"/>
+        </w:tabs>
+        <w:bidi w:val="0"/>
+        <w:ind w:hanging="283" w:left="709"/>
+        <w:jc w:val="left"/>
+        <w:rPr/>
+      </w:pPr>
+      <w:r>
+        <w:rPr>
+          <w:b/>
+        </w:rPr>
+        <w:t>Auditoría:</w:t>
+      </w:r>
+      <w:r>
+        <w:rPr/>
+        <w:t xml:space="preserve"> el helper de catálogo existía, pero no se utilizaba. Ahora se registran productos, precios, presentaciones, sucursales fiscales, compras, movimientos de almacén, configuración y aperturas/cierres de caja, con actor y valores relevantes. Los cambios y su auditoría se guardan juntos; estas operaciones requieren una sesión autenticada.</w:t>
+      </w:r>
+    </w:p>
+    <w:p>
+      <w:pPr>
+        <w:pStyle w:val="BodyText"/>
+        <w:numPr>
+          <w:ilvl w:val="0"/>
+          <w:numId w:val="6"/>
+        </w:numPr>
+        <w:tabs>
+          <w:tab w:val="clear" w:pos="709"/>
+          <w:tab w:val="left" w:pos="709" w:leader="none"/>
+        </w:tabs>
+        <w:bidi w:val="0"/>
+        <w:ind w:hanging="283" w:left="709"/>
+        <w:jc w:val="left"/>
+        <w:rPr/>
+      </w:pPr>
+      <w:r>
+        <w:rPr>
+          <w:b/>
+        </w:rPr>
+        <w:t>Integridad contable e inventario:</w:t>
+      </w:r>
+      <w:r>
+        <w:rPr/>
+        <w:t xml:space="preserve"> los errores al crear la póliza de un gasto ya no se silencian; la operación relacional se revierte si falla. También se impiden cambios contables o eliminación de gastos ya contabilizados sin una póliza de ajuste. Añadí validaciones contra precios, stock y traspasos inválidos.</w:t>
+      </w:r>
+    </w:p>
+    <w:p>
+      <w:pPr>
+        <w:pStyle w:val="BodyText"/>
+        <w:numPr>
+          <w:ilvl w:val="0"/>
+          <w:numId w:val="6"/>
+        </w:numPr>
+        <w:tabs>
+          <w:tab w:val="clear" w:pos="709"/>
+          <w:tab w:val="left" w:pos="709" w:leader="none"/>
+        </w:tabs>
+        <w:bidi w:val="0"/>
+        <w:ind w:hanging="283" w:left="709"/>
+        <w:jc w:val="left"/>
+        <w:rPr/>
+      </w:pPr>
+      <w:r>
+        <w:rPr>
+          <w:b/>
+        </w:rPr>
+        <w:t>Documentación:</w:t>
+      </w:r>
+      <w:r>
+        <w:rPr/>
+        <w:t xml:space="preserve"> registré la decisión de bloquear operaciones en periodos cerrados y lo que aún requiere validación manual en </w:t>
+      </w:r>
+      <w:r>
+        <w:rPr>
+          <w:rFonts w:ascii="Liberation Mono" w:hAnsi="Liberation Mono"/>
+        </w:rPr>
+        <w:t>Por realizar 15 de octubre.md</w:t>
+      </w:r>
+      <w:r>
+        <w:rPr/>
+        <w:t>.</w:t>
+      </w:r>
+    </w:p>
+    <w:p>
+      <w:pPr>
+        <w:pStyle w:val="BodyText"/>
+        <w:bidi w:val="0"/>
+        <w:jc w:val="left"/>
+        <w:rPr/>
+      </w:pPr>
+      <w:r>
+        <w:rPr/>
+        <w:t xml:space="preserve">Validación: </w:t>
+      </w:r>
+      <w:r>
+        <w:rPr>
+          <w:b/>
+        </w:rPr>
+        <w:t>24 pruebas</w:t>
+      </w:r>
+      <w:r>
+        <w:rPr/>
+        <w:t xml:space="preserve"> de auditoría y contabilidad aprobadas, compilación de </w:t>
+      </w:r>
+      <w:r>
+        <w:rPr>
+          <w:rFonts w:ascii="Liberation Mono" w:hAnsi="Liberation Mono"/>
+        </w:rPr>
+        <w:t>OilsMexico.Web</w:t>
+      </w:r>
+      <w:r>
+        <w:rPr/>
+        <w:t xml:space="preserve"> correcta y </w:t>
+      </w:r>
+      <w:r>
+        <w:rPr>
+          <w:rFonts w:ascii="Liberation Mono" w:hAnsi="Liberation Mono"/>
+        </w:rPr>
+        <w:t>git diff --check</w:t>
+      </w:r>
+      <w:r>
+        <w:rPr/>
+        <w:t xml:space="preserve"> sin errores. La conciliación visual en UI y la comunicación de las limitaciones de los reportes históricos siguen pendientes.</w:t>
       </w:r>
     </w:p>
     <w:p>
@@ -3840,6 +6578,143 @@
       </w:rPr>
     </w:lvl>
   </w:abstractNum>
+  <w:abstractNum w:abstractNumId="6">
+    <w:lvl w:ilvl="0">
+      <w:start w:val="1"/>
+      <w:numFmt w:val="bullet"/>
+      <w:lvlText w:val=""/>
+      <w:lvlJc w:val="left"/>
+      <w:pPr>
+        <w:tabs>
+          <w:tab w:val="num" w:pos="709"/>
+        </w:tabs>
+        <w:ind w:left="709" w:hanging="283"/>
+      </w:pPr>
+      <w:rPr>
+        <w:rFonts w:ascii="Symbol" w:hAnsi="Symbol" w:cs="Symbol" w:hint="default"/>
+      </w:rPr>
+    </w:lvl>
+    <w:lvl w:ilvl="1">
+      <w:start w:val="1"/>
+      <w:numFmt w:val="bullet"/>
+      <w:lvlText w:val=""/>
+      <w:lvlJc w:val="left"/>
+      <w:pPr>
+        <w:tabs>
+          <w:tab w:val="num" w:pos="1418"/>
+        </w:tabs>
+        <w:ind w:left="1418" w:hanging="283"/>
+      </w:pPr>
+      <w:rPr>
+        <w:rFonts w:ascii="Symbol" w:hAnsi="Symbol" w:cs="Symbol" w:hint="default"/>
+      </w:rPr>
+    </w:lvl>
+    <w:lvl w:ilvl="2">
+      <w:start w:val="1"/>
+      <w:numFmt w:val="bullet"/>
+      <w:lvlText w:val=""/>
+      <w:lvlJc w:val="left"/>
+      <w:pPr>
+        <w:tabs>
+          <w:tab w:val="num" w:pos="2127"/>
+        </w:tabs>
+        <w:ind w:left="2127" w:hanging="283"/>
+      </w:pPr>
+      <w:rPr>
+        <w:rFonts w:ascii="Symbol" w:hAnsi="Symbol" w:cs="Symbol" w:hint="default"/>
+      </w:rPr>
+    </w:lvl>
+    <w:lvl w:ilvl="3">
+      <w:start w:val="1"/>
+      <w:numFmt w:val="bullet"/>
+      <w:lvlText w:val=""/>
+      <w:lvlJc w:val="left"/>
+      <w:pPr>
+        <w:tabs>
+          <w:tab w:val="num" w:pos="2836"/>
+        </w:tabs>
+        <w:ind w:left="2836" w:hanging="283"/>
+      </w:pPr>
+      <w:rPr>
+        <w:rFonts w:ascii="Symbol" w:hAnsi="Symbol" w:cs="Symbol" w:hint="default"/>
+      </w:rPr>
+    </w:lvl>
+    <w:lvl w:ilvl="4">
+      <w:start w:val="1"/>
+      <w:numFmt w:val="bullet"/>
+      <w:lvlText w:val=""/>
+      <w:lvlJc w:val="left"/>
+      <w:pPr>
+        <w:tabs>
+          <w:tab w:val="num" w:pos="3545"/>
+        </w:tabs>
+        <w:ind w:left="3545" w:hanging="283"/>
+      </w:pPr>
+      <w:rPr>
+        <w:rFonts w:ascii="Symbol" w:hAnsi="Symbol" w:cs="Symbol" w:hint="default"/>
+      </w:rPr>
+    </w:lvl>
+    <w:lvl w:ilvl="5">
+      <w:start w:val="1"/>
+      <w:numFmt w:val="bullet"/>
+      <w:lvlText w:val=""/>
+      <w:lvlJc w:val="left"/>
+      <w:pPr>
+        <w:tabs>
+          <w:tab w:val="num" w:pos="4254"/>
+        </w:tabs>
+        <w:ind w:left="4254" w:hanging="283"/>
+      </w:pPr>
+      <w:rPr>
+        <w:rFonts w:ascii="Symbol" w:hAnsi="Symbol" w:cs="Symbol" w:hint="default"/>
+      </w:rPr>
+    </w:lvl>
+    <w:lvl w:ilvl="6">
+      <w:start w:val="1"/>
+      <w:numFmt w:val="bullet"/>
+      <w:lvlText w:val=""/>
+      <w:lvlJc w:val="left"/>
+      <w:pPr>
+        <w:tabs>
+          <w:tab w:val="num" w:pos="4963"/>
+        </w:tabs>
+        <w:ind w:left="4963" w:hanging="283"/>
+      </w:pPr>
+      <w:rPr>
+        <w:rFonts w:ascii="Symbol" w:hAnsi="Symbol" w:cs="Symbol" w:hint="default"/>
+      </w:rPr>
+    </w:lvl>
+    <w:lvl w:ilvl="7">
+      <w:start w:val="1"/>
+      <w:numFmt w:val="bullet"/>
+      <w:lvlText w:val=""/>
+      <w:lvlJc w:val="left"/>
+      <w:pPr>
+        <w:tabs>
+          <w:tab w:val="num" w:pos="5672"/>
+        </w:tabs>
+        <w:ind w:left="5672" w:hanging="283"/>
+      </w:pPr>
+      <w:rPr>
+        <w:rFonts w:ascii="Symbol" w:hAnsi="Symbol" w:cs="Symbol" w:hint="default"/>
+      </w:rPr>
+    </w:lvl>
+    <w:lvl w:ilvl="8">
+      <w:start w:val="1"/>
+      <w:numFmt w:val="bullet"/>
+      <w:lvlText w:val=""/>
+      <w:lvlJc w:val="left"/>
+      <w:pPr>
+        <w:tabs>
+          <w:tab w:val="num" w:pos="6381"/>
+        </w:tabs>
+        <w:ind w:left="6381" w:hanging="283"/>
+      </w:pPr>
+      <w:rPr>
+        <w:rFonts w:ascii="Symbol" w:hAnsi="Symbol" w:cs="Symbol" w:hint="default"/>
+      </w:rPr>
+    </w:lvl>
+  </w:abstractNum>
   <w:num w:numId="1">
     <w:abstractNumId w:val="1"/>
   </w:num>
@@ -3854,6 +6729,9 @@
   </w:num>
   <w:num w:numId="5">
     <w:abstractNumId w:val="5"/>
+  </w:num>
+  <w:num w:numId="6">
+    <w:abstractNumId w:val="6"/>
   </w:num>
 </w:numbering>
 </file>

</xml_diff>